<commit_message>
Cambio de plantilla para extraer datos
</commit_message>
<xml_diff>
--- a/backend/templates/plantilla_manera2.docx
+++ b/backend/templates/plantilla_manera2.docx
@@ -2399,8 +2399,6 @@
       <w:r>
         <w:rPr>
           <w:rFonts w:ascii="Arial" w:eastAsia="Batang" w:hAnsi="Arial" w:cs="Arial"/>
-          <w:b/>
-          <w:bCs/>
           <w:sz w:val="14"/>
           <w:szCs w:val="14"/>
           <w:lang w:val="es-MX"/>
@@ -2410,8 +2408,6 @@
       <w:r>
         <w:rPr>
           <w:rFonts w:ascii="Arial" w:eastAsia="Batang" w:hAnsi="Arial" w:cs="Arial"/>
-          <w:b/>
-          <w:bCs/>
           <w:sz w:val="14"/>
           <w:szCs w:val="14"/>
           <w:lang w:val="es-MX"/>
@@ -5222,8 +5218,7 @@
       <w:pPr>
         <w:pStyle w:val="Sinespaciado"/>
         <w:tabs>
-          <w:tab w:val="left" w:leader="hyphen" w:pos="709"/>
-          <w:tab w:val="right" w:leader="hyphen" w:pos="8220"/>
+          <w:tab w:val="right" w:leader="hyphen" w:pos="9129"/>
         </w:tabs>
         <w:spacing w:line="360" w:lineRule="auto"/>
         <w:jc w:val="both"/>
@@ -5232,7 +5227,6 @@
           <w:bCs/>
           <w:sz w:val="14"/>
           <w:szCs w:val="14"/>
-          <w:lang w:val="es-MX"/>
         </w:rPr>
       </w:pPr>
       <w:r>
@@ -5272,7 +5266,16 @@
           <w:szCs w:val="14"/>
           <w:lang w:val="es-MX"/>
         </w:rPr>
-        <w:t xml:space="preserve">.- De conformidad con lo establecido en la Ley Federal de Protección de Datos Personales en Posesión de los Particulares y su Reglamento, hice saber y expliqué al compareciente de este instrumento, el contenido íntegro del aviso de privacidad que se encuentra exhibido en diversas áreas de las oficinas del suscrito Notario y en la página de internet </w:t>
+        <w:t xml:space="preserve">.- </w:t>
+      </w:r>
+      <w:bookmarkEnd w:id="19"/>
+      <w:r>
+        <w:rPr>
+          <w:rFonts w:ascii="Arial" w:hAnsi="Arial" w:cs="Arial"/>
+          <w:sz w:val="14"/>
+          <w:szCs w:val="14"/>
+        </w:rPr>
+        <w:t xml:space="preserve">De conformidad con lo establecido en la Ley Federal de Protección de Datos Personales en Posesión de los Particulares y su Reglamento, hice saber y expliqué a la compareciente de este instrumento, el contenido íntegro del aviso de privacidad que se encuentra exhibido en diversas áreas de las oficinas del suscrito Notario y en la página de internet </w:t>
       </w:r>
       <w:hyperlink r:id="rId11" w:history="1">
         <w:r>
@@ -5281,7 +5284,6 @@
             <w:rFonts w:ascii="Arial" w:hAnsi="Arial" w:cs="Arial"/>
             <w:sz w:val="14"/>
             <w:szCs w:val="14"/>
-            <w:lang w:val="es-MX"/>
           </w:rPr>
           <w:t>www.notariapublica168em.com</w:t>
         </w:r>
@@ -5291,185 +5293,1151 @@
           <w:rFonts w:ascii="Arial" w:hAnsi="Arial" w:cs="Arial"/>
           <w:sz w:val="14"/>
           <w:szCs w:val="14"/>
-          <w:lang w:val="es-MX"/>
-        </w:rPr>
-        <w:t>, por lo que con la firma del presente instrumento, el compareciente manifiesta su consentimiento expreso con el tratamiento de sus datos personales.</w:t>
-      </w:r>
-      <w:r>
-        <w:rPr>
-          <w:rFonts w:ascii="Arial" w:hAnsi="Arial" w:cs="Arial"/>
-          <w:sz w:val="14"/>
-          <w:szCs w:val="14"/>
-          <w:lang w:val="es-MX"/>
+        </w:rPr>
+        <w:t>, por lo que con la firma del presente instrumento, la compareciente manifiesta su consentimiento expreso con el tratamiento de sus datos personales.</w:t>
+      </w:r>
+      <w:r>
+        <w:rPr>
+          <w:rFonts w:ascii="Arial" w:hAnsi="Arial" w:cs="Arial"/>
+          <w:sz w:val="14"/>
+          <w:szCs w:val="14"/>
         </w:rPr>
         <w:tab/>
       </w:r>
-      <w:bookmarkEnd w:id="19"/>
     </w:p>
     <w:p>
       <w:pPr>
         <w:pStyle w:val="Sinespaciado"/>
         <w:tabs>
+          <w:tab w:val="right" w:leader="hyphen" w:pos="9129"/>
+        </w:tabs>
+        <w:spacing w:line="360" w:lineRule="auto"/>
+        <w:jc w:val="both"/>
+        <w:rPr>
+          <w:rFonts w:ascii="Arial" w:hAnsi="Arial" w:cs="Arial"/>
+          <w:bCs/>
+          <w:sz w:val="14"/>
+          <w:szCs w:val="14"/>
+        </w:rPr>
+      </w:pPr>
+      <w:r>
+        <w:rPr>
+          <w:rFonts w:ascii="Arial" w:hAnsi="Arial" w:cs="Arial"/>
+          <w:sz w:val="14"/>
+          <w:szCs w:val="14"/>
+          <w:lang w:val="es-MX"/>
+        </w:rPr>
+        <w:t xml:space="preserve">-------- </w:t>
+      </w:r>
+      <w:r>
+        <w:rPr>
+          <w:rFonts w:ascii="Arial" w:eastAsia="MS Mincho" w:hAnsi="Arial" w:cs="Arial"/>
+          <w:sz w:val="14"/>
+          <w:szCs w:val="14"/>
+          <w:lang w:val="es-MX"/>
+        </w:rPr>
+        <w:t xml:space="preserve">VI.- Que leí este instrumento a la compareciente, a quien le expliqué su valor, fuerza y las consecuencias legales de su contenido, manifestando su conformidad con el mismo, por lo que lo otorga, ratifica y </w:t>
+      </w:r>
+      <w:r>
+        <w:rPr>
+          <w:rFonts w:ascii="Arial" w:hAnsi="Arial" w:cs="Arial"/>
+          <w:sz w:val="14"/>
+          <w:szCs w:val="14"/>
+        </w:rPr>
+        <w:t xml:space="preserve">firma ante mí el día                                 del mes de                             del año dos mil </w:t>
+      </w:r>
+      <w:r>
+        <w:rPr>
+          <w:rFonts w:ascii="Arial" w:hAnsi="Arial" w:cs="Arial"/>
+          <w:sz w:val="14"/>
+          <w:szCs w:val="14"/>
+          <w:lang w:val="es-ES" w:eastAsia="es-MX"/>
+        </w:rPr>
+        <w:t>veintiséis</w:t>
+      </w:r>
+      <w:r>
+        <w:rPr>
+          <w:rFonts w:ascii="Arial" w:hAnsi="Arial" w:cs="Arial"/>
+          <w:sz w:val="14"/>
+          <w:szCs w:val="14"/>
+        </w:rPr>
+        <w:t>, mismo momento en que lo autorizo definitivamente. - Doy fe.</w:t>
+      </w:r>
+      <w:r>
+        <w:rPr>
+          <w:rFonts w:ascii="Arial" w:hAnsi="Arial" w:cs="Arial"/>
+          <w:sz w:val="14"/>
+          <w:szCs w:val="14"/>
+        </w:rPr>
+        <w:tab/>
+      </w:r>
+    </w:p>
+    <w:p>
+      <w:pPr>
+        <w:pStyle w:val="Sinespaciado"/>
+        <w:tabs>
+          <w:tab w:val="left" w:leader="hyphen" w:pos="709"/>
+          <w:tab w:val="right" w:leader="hyphen" w:pos="9072"/>
+          <w:tab w:val="right" w:leader="hyphen" w:pos="9129"/>
+        </w:tabs>
+        <w:spacing w:line="360" w:lineRule="auto"/>
+        <w:jc w:val="both"/>
+        <w:rPr>
+          <w:rFonts w:ascii="Arial" w:hAnsi="Arial" w:cs="Arial"/>
+          <w:sz w:val="14"/>
+          <w:szCs w:val="14"/>
+        </w:rPr>
+      </w:pPr>
+    </w:p>
+    <w:p>
+      <w:pPr>
+        <w:pStyle w:val="Sinespaciado"/>
+        <w:tabs>
+          <w:tab w:val="left" w:leader="hyphen" w:pos="709"/>
+          <w:tab w:val="right" w:leader="hyphen" w:pos="9072"/>
+          <w:tab w:val="right" w:leader="hyphen" w:pos="9129"/>
+        </w:tabs>
+        <w:spacing w:line="360" w:lineRule="auto"/>
+        <w:jc w:val="both"/>
+        <w:rPr>
+          <w:rFonts w:ascii="Arial" w:hAnsi="Arial" w:cs="Arial"/>
+          <w:sz w:val="14"/>
+          <w:szCs w:val="14"/>
+        </w:rPr>
+      </w:pPr>
+    </w:p>
+    <w:p>
+      <w:pPr>
+        <w:pStyle w:val="Sinespaciado"/>
+        <w:tabs>
+          <w:tab w:val="left" w:leader="hyphen" w:pos="709"/>
+          <w:tab w:val="right" w:leader="hyphen" w:pos="9072"/>
+          <w:tab w:val="right" w:leader="hyphen" w:pos="9129"/>
+        </w:tabs>
+        <w:spacing w:line="360" w:lineRule="auto"/>
+        <w:jc w:val="both"/>
+        <w:rPr>
+          <w:rFonts w:ascii="Arial" w:hAnsi="Arial" w:cs="Arial"/>
+          <w:sz w:val="14"/>
+          <w:szCs w:val="14"/>
+        </w:rPr>
+      </w:pPr>
+    </w:p>
+    <w:p>
+      <w:pPr>
+        <w:pStyle w:val="Sinespaciado"/>
+        <w:tabs>
+          <w:tab w:val="left" w:leader="hyphen" w:pos="709"/>
+          <w:tab w:val="right" w:leader="hyphen" w:pos="9072"/>
+          <w:tab w:val="right" w:leader="hyphen" w:pos="9129"/>
+        </w:tabs>
+        <w:spacing w:line="360" w:lineRule="auto"/>
+        <w:jc w:val="both"/>
+        <w:rPr>
+          <w:rFonts w:ascii="Arial" w:hAnsi="Arial" w:cs="Arial"/>
+          <w:sz w:val="14"/>
+          <w:szCs w:val="14"/>
+        </w:rPr>
+      </w:pPr>
+    </w:p>
+    <w:p>
+      <w:pPr>
+        <w:pStyle w:val="Sinespaciado"/>
+        <w:tabs>
+          <w:tab w:val="left" w:leader="hyphen" w:pos="709"/>
+          <w:tab w:val="right" w:leader="hyphen" w:pos="9072"/>
+          <w:tab w:val="right" w:leader="hyphen" w:pos="9129"/>
+        </w:tabs>
+        <w:spacing w:line="360" w:lineRule="auto"/>
+        <w:jc w:val="both"/>
+        <w:rPr>
+          <w:rFonts w:ascii="Arial" w:hAnsi="Arial" w:cs="Arial"/>
+          <w:sz w:val="14"/>
+          <w:szCs w:val="14"/>
+        </w:rPr>
+      </w:pPr>
+    </w:p>
+    <w:p>
+      <w:pPr>
+        <w:pStyle w:val="Sinespaciado"/>
+        <w:tabs>
+          <w:tab w:val="left" w:leader="hyphen" w:pos="709"/>
+          <w:tab w:val="right" w:leader="hyphen" w:pos="9072"/>
+          <w:tab w:val="right" w:leader="hyphen" w:pos="9129"/>
+        </w:tabs>
+        <w:spacing w:line="360" w:lineRule="auto"/>
+        <w:jc w:val="both"/>
+        <w:rPr>
+          <w:rFonts w:ascii="Arial" w:hAnsi="Arial" w:cs="Arial"/>
+          <w:sz w:val="14"/>
+          <w:szCs w:val="14"/>
+        </w:rPr>
+      </w:pPr>
+    </w:p>
+    <w:p>
+      <w:pPr>
+        <w:pStyle w:val="Sinespaciado"/>
+        <w:tabs>
+          <w:tab w:val="left" w:leader="hyphen" w:pos="709"/>
+          <w:tab w:val="right" w:leader="hyphen" w:pos="9072"/>
+          <w:tab w:val="right" w:leader="hyphen" w:pos="9129"/>
+        </w:tabs>
+        <w:spacing w:line="360" w:lineRule="auto"/>
+        <w:jc w:val="both"/>
+        <w:rPr>
+          <w:rFonts w:ascii="Arial" w:hAnsi="Arial" w:cs="Arial"/>
+          <w:sz w:val="14"/>
+          <w:szCs w:val="14"/>
+        </w:rPr>
+      </w:pPr>
+    </w:p>
+    <w:p>
+      <w:pPr>
+        <w:pStyle w:val="Sinespaciado"/>
+        <w:tabs>
+          <w:tab w:val="left" w:leader="hyphen" w:pos="709"/>
+          <w:tab w:val="right" w:leader="hyphen" w:pos="9072"/>
+          <w:tab w:val="right" w:leader="hyphen" w:pos="9129"/>
+        </w:tabs>
+        <w:spacing w:line="360" w:lineRule="auto"/>
+        <w:jc w:val="both"/>
+        <w:rPr>
+          <w:rFonts w:ascii="Arial" w:hAnsi="Arial" w:cs="Arial"/>
+          <w:sz w:val="14"/>
+          <w:szCs w:val="14"/>
+        </w:rPr>
+      </w:pPr>
+    </w:p>
+    <w:p>
+      <w:pPr>
+        <w:pStyle w:val="Sinespaciado"/>
+        <w:tabs>
+          <w:tab w:val="left" w:leader="hyphen" w:pos="709"/>
+          <w:tab w:val="right" w:leader="hyphen" w:pos="9072"/>
+          <w:tab w:val="right" w:leader="hyphen" w:pos="9129"/>
+        </w:tabs>
+        <w:spacing w:line="360" w:lineRule="auto"/>
+        <w:jc w:val="both"/>
+        <w:rPr>
+          <w:rFonts w:ascii="Arial" w:hAnsi="Arial" w:cs="Arial"/>
+          <w:sz w:val="14"/>
+          <w:szCs w:val="14"/>
+        </w:rPr>
+      </w:pPr>
+    </w:p>
+    <w:p>
+      <w:pPr>
+        <w:pStyle w:val="Sinespaciado"/>
+        <w:tabs>
+          <w:tab w:val="left" w:leader="hyphen" w:pos="709"/>
+          <w:tab w:val="right" w:leader="hyphen" w:pos="9072"/>
+          <w:tab w:val="right" w:leader="hyphen" w:pos="9129"/>
+        </w:tabs>
+        <w:spacing w:line="360" w:lineRule="auto"/>
+        <w:jc w:val="both"/>
+        <w:rPr>
+          <w:rFonts w:ascii="Arial" w:hAnsi="Arial" w:cs="Arial"/>
+          <w:sz w:val="14"/>
+          <w:szCs w:val="14"/>
+        </w:rPr>
+      </w:pPr>
+    </w:p>
+    <w:p>
+      <w:pPr>
+        <w:pStyle w:val="Sinespaciado"/>
+        <w:tabs>
+          <w:tab w:val="left" w:leader="hyphen" w:pos="709"/>
+          <w:tab w:val="right" w:leader="hyphen" w:pos="9072"/>
+          <w:tab w:val="right" w:leader="hyphen" w:pos="9129"/>
+        </w:tabs>
+        <w:spacing w:line="360" w:lineRule="auto"/>
+        <w:jc w:val="both"/>
+        <w:rPr>
+          <w:rFonts w:ascii="Arial" w:hAnsi="Arial" w:cs="Arial"/>
+          <w:sz w:val="14"/>
+          <w:szCs w:val="14"/>
+        </w:rPr>
+      </w:pPr>
+    </w:p>
+    <w:p>
+      <w:pPr>
+        <w:pStyle w:val="Sinespaciado"/>
+        <w:tabs>
+          <w:tab w:val="left" w:leader="hyphen" w:pos="709"/>
+          <w:tab w:val="right" w:leader="hyphen" w:pos="9072"/>
+          <w:tab w:val="right" w:leader="hyphen" w:pos="9129"/>
+        </w:tabs>
+        <w:spacing w:line="360" w:lineRule="auto"/>
+        <w:jc w:val="center"/>
+        <w:rPr>
+          <w:rFonts w:ascii="Arial" w:hAnsi="Arial" w:cs="Arial"/>
+          <w:sz w:val="14"/>
+          <w:szCs w:val="14"/>
+        </w:rPr>
+      </w:pPr>
+    </w:p>
+    <w:p>
+      <w:pPr>
+        <w:pStyle w:val="Sinespaciado"/>
+        <w:tabs>
+          <w:tab w:val="left" w:leader="hyphen" w:pos="709"/>
+          <w:tab w:val="right" w:leader="hyphen" w:pos="9072"/>
+          <w:tab w:val="right" w:leader="hyphen" w:pos="9129"/>
+        </w:tabs>
+        <w:spacing w:line="360" w:lineRule="auto"/>
+        <w:jc w:val="center"/>
+        <w:rPr>
+          <w:rFonts w:ascii="Arial" w:hAnsi="Arial" w:cs="Arial"/>
+          <w:sz w:val="14"/>
+          <w:szCs w:val="14"/>
+        </w:rPr>
+      </w:pPr>
+      <w:r>
+        <w:rPr>
+          <w:rFonts w:ascii="Arial" w:hAnsi="Arial" w:cs="Arial"/>
+          <w:sz w:val="14"/>
+          <w:szCs w:val="14"/>
+        </w:rPr>
+        <w:t>______________________________________</w:t>
+      </w:r>
+    </w:p>
+    <w:p>
+      <w:pPr>
+        <w:pStyle w:val="Sinespaciado"/>
+        <w:tabs>
+          <w:tab w:val="left" w:leader="hyphen" w:pos="709"/>
+          <w:tab w:val="right" w:leader="hyphen" w:pos="9072"/>
+          <w:tab w:val="right" w:leader="hyphen" w:pos="9129"/>
+        </w:tabs>
+        <w:spacing w:line="360" w:lineRule="auto"/>
+        <w:jc w:val="center"/>
+        <w:rPr>
+          <w:rFonts w:ascii="Arial" w:hAnsi="Arial" w:cs="Arial"/>
+          <w:sz w:val="14"/>
+          <w:szCs w:val="14"/>
+        </w:rPr>
+      </w:pPr>
+      <w:r>
+        <w:rPr>
+          <w:rFonts w:ascii="Arial" w:hAnsi="Arial" w:cs="Arial"/>
+          <w:b/>
+          <w:bCs/>
+          <w:sz w:val="14"/>
+          <w:szCs w:val="14"/>
+        </w:rPr>
+        <w:t>BENITA HERNÁNDEZ CERÓN</w:t>
+      </w:r>
+    </w:p>
+    <w:p>
+      <w:pPr>
+        <w:pStyle w:val="Sinespaciado"/>
+        <w:tabs>
+          <w:tab w:val="left" w:leader="hyphen" w:pos="709"/>
+          <w:tab w:val="right" w:leader="hyphen" w:pos="9072"/>
+          <w:tab w:val="right" w:leader="hyphen" w:pos="9129"/>
+        </w:tabs>
+        <w:spacing w:line="360" w:lineRule="auto"/>
+        <w:jc w:val="both"/>
+        <w:rPr>
+          <w:rFonts w:ascii="Arial" w:hAnsi="Arial" w:cs="Arial"/>
+          <w:sz w:val="14"/>
+          <w:szCs w:val="14"/>
+        </w:rPr>
+      </w:pPr>
+    </w:p>
+    <w:p>
+      <w:pPr>
+        <w:pStyle w:val="Sinespaciado"/>
+        <w:tabs>
+          <w:tab w:val="left" w:leader="hyphen" w:pos="709"/>
+          <w:tab w:val="right" w:leader="hyphen" w:pos="9072"/>
+          <w:tab w:val="right" w:leader="hyphen" w:pos="9129"/>
+        </w:tabs>
+        <w:spacing w:line="360" w:lineRule="auto"/>
+        <w:jc w:val="both"/>
+        <w:rPr>
+          <w:rFonts w:ascii="Arial" w:hAnsi="Arial" w:cs="Arial"/>
+          <w:sz w:val="14"/>
+          <w:szCs w:val="14"/>
+        </w:rPr>
+      </w:pPr>
+    </w:p>
+    <w:p>
+      <w:pPr>
+        <w:pStyle w:val="Sinespaciado"/>
+        <w:tabs>
+          <w:tab w:val="left" w:leader="hyphen" w:pos="709"/>
+          <w:tab w:val="right" w:leader="hyphen" w:pos="9072"/>
+          <w:tab w:val="right" w:leader="hyphen" w:pos="9129"/>
+        </w:tabs>
+        <w:spacing w:line="360" w:lineRule="auto"/>
+        <w:jc w:val="both"/>
+        <w:rPr>
+          <w:rFonts w:ascii="Arial" w:hAnsi="Arial" w:cs="Arial"/>
+          <w:sz w:val="14"/>
+          <w:szCs w:val="14"/>
+        </w:rPr>
+      </w:pPr>
+    </w:p>
+    <w:p>
+      <w:pPr>
+        <w:pStyle w:val="Sinespaciado"/>
+        <w:tabs>
+          <w:tab w:val="left" w:leader="hyphen" w:pos="709"/>
+          <w:tab w:val="right" w:leader="hyphen" w:pos="9072"/>
+          <w:tab w:val="right" w:leader="hyphen" w:pos="9129"/>
+        </w:tabs>
+        <w:spacing w:line="360" w:lineRule="auto"/>
+        <w:jc w:val="both"/>
+        <w:rPr>
+          <w:rFonts w:ascii="Arial" w:hAnsi="Arial" w:cs="Arial"/>
+          <w:sz w:val="14"/>
+          <w:szCs w:val="14"/>
+        </w:rPr>
+      </w:pPr>
+    </w:p>
+    <w:p>
+      <w:pPr>
+        <w:pStyle w:val="Sinespaciado"/>
+        <w:tabs>
+          <w:tab w:val="left" w:leader="hyphen" w:pos="709"/>
+          <w:tab w:val="right" w:leader="hyphen" w:pos="9072"/>
+          <w:tab w:val="right" w:leader="hyphen" w:pos="9129"/>
+        </w:tabs>
+        <w:spacing w:line="360" w:lineRule="auto"/>
+        <w:jc w:val="both"/>
+        <w:rPr>
+          <w:rFonts w:ascii="Arial" w:hAnsi="Arial" w:cs="Arial"/>
+          <w:sz w:val="14"/>
+          <w:szCs w:val="14"/>
+        </w:rPr>
+      </w:pPr>
+    </w:p>
+    <w:p>
+      <w:pPr>
+        <w:pStyle w:val="Sinespaciado"/>
+        <w:tabs>
+          <w:tab w:val="left" w:leader="hyphen" w:pos="709"/>
+          <w:tab w:val="right" w:leader="hyphen" w:pos="9072"/>
+          <w:tab w:val="right" w:leader="hyphen" w:pos="9129"/>
+        </w:tabs>
+        <w:spacing w:line="360" w:lineRule="auto"/>
+        <w:jc w:val="both"/>
+        <w:rPr>
+          <w:rFonts w:ascii="Arial" w:hAnsi="Arial" w:cs="Arial"/>
+          <w:sz w:val="14"/>
+          <w:szCs w:val="14"/>
+        </w:rPr>
+      </w:pPr>
+    </w:p>
+    <w:p>
+      <w:pPr>
+        <w:pStyle w:val="Sinespaciado"/>
+        <w:tabs>
+          <w:tab w:val="left" w:leader="hyphen" w:pos="709"/>
+          <w:tab w:val="right" w:leader="hyphen" w:pos="9072"/>
+          <w:tab w:val="right" w:leader="hyphen" w:pos="9129"/>
+        </w:tabs>
+        <w:spacing w:line="360" w:lineRule="auto"/>
+        <w:jc w:val="both"/>
+        <w:rPr>
+          <w:rFonts w:ascii="Arial" w:hAnsi="Arial" w:cs="Arial"/>
+          <w:sz w:val="14"/>
+          <w:szCs w:val="14"/>
+        </w:rPr>
+      </w:pPr>
+    </w:p>
+    <w:p>
+      <w:pPr>
+        <w:pStyle w:val="Sinespaciado"/>
+        <w:tabs>
+          <w:tab w:val="left" w:leader="hyphen" w:pos="709"/>
+          <w:tab w:val="right" w:leader="hyphen" w:pos="9072"/>
+          <w:tab w:val="right" w:leader="hyphen" w:pos="9129"/>
+        </w:tabs>
+        <w:spacing w:line="360" w:lineRule="auto"/>
+        <w:jc w:val="both"/>
+        <w:rPr>
+          <w:rFonts w:ascii="Arial" w:hAnsi="Arial" w:cs="Arial"/>
+          <w:sz w:val="14"/>
+          <w:szCs w:val="14"/>
+        </w:rPr>
+      </w:pPr>
+    </w:p>
+    <w:p>
+      <w:pPr>
+        <w:pStyle w:val="Sinespaciado"/>
+        <w:tabs>
+          <w:tab w:val="left" w:leader="hyphen" w:pos="709"/>
+          <w:tab w:val="right" w:leader="hyphen" w:pos="9072"/>
+          <w:tab w:val="right" w:leader="hyphen" w:pos="9129"/>
+        </w:tabs>
+        <w:spacing w:line="360" w:lineRule="auto"/>
+        <w:jc w:val="both"/>
+        <w:rPr>
+          <w:rFonts w:ascii="Arial" w:hAnsi="Arial" w:cs="Arial"/>
+          <w:sz w:val="14"/>
+          <w:szCs w:val="14"/>
+        </w:rPr>
+      </w:pPr>
+    </w:p>
+    <w:p>
+      <w:pPr>
+        <w:pStyle w:val="Sinespaciado"/>
+        <w:tabs>
+          <w:tab w:val="left" w:leader="hyphen" w:pos="709"/>
+          <w:tab w:val="right" w:leader="hyphen" w:pos="9072"/>
+          <w:tab w:val="right" w:leader="hyphen" w:pos="9129"/>
+        </w:tabs>
+        <w:spacing w:line="360" w:lineRule="auto"/>
+        <w:jc w:val="center"/>
+        <w:rPr>
+          <w:rFonts w:ascii="Arial" w:hAnsi="Arial" w:cs="Arial"/>
+          <w:sz w:val="14"/>
+          <w:szCs w:val="14"/>
+        </w:rPr>
+      </w:pPr>
+    </w:p>
+    <w:p>
+      <w:pPr>
+        <w:pStyle w:val="Sinespaciado"/>
+        <w:tabs>
+          <w:tab w:val="left" w:leader="hyphen" w:pos="709"/>
+          <w:tab w:val="right" w:leader="hyphen" w:pos="9072"/>
+          <w:tab w:val="right" w:leader="hyphen" w:pos="9129"/>
+        </w:tabs>
+        <w:spacing w:line="360" w:lineRule="auto"/>
+        <w:jc w:val="center"/>
+        <w:rPr>
+          <w:rFonts w:ascii="Arial" w:hAnsi="Arial" w:cs="Arial"/>
+          <w:sz w:val="14"/>
+          <w:szCs w:val="14"/>
+        </w:rPr>
+      </w:pPr>
+    </w:p>
+    <w:p>
+      <w:pPr>
+        <w:pStyle w:val="Sinespaciado"/>
+        <w:tabs>
+          <w:tab w:val="left" w:leader="hyphen" w:pos="709"/>
+          <w:tab w:val="right" w:leader="hyphen" w:pos="9072"/>
+          <w:tab w:val="right" w:leader="hyphen" w:pos="9129"/>
+        </w:tabs>
+        <w:spacing w:line="360" w:lineRule="auto"/>
+        <w:jc w:val="center"/>
+        <w:rPr>
+          <w:rFonts w:ascii="Arial" w:hAnsi="Arial" w:cs="Arial"/>
+          <w:sz w:val="14"/>
+          <w:szCs w:val="14"/>
+        </w:rPr>
+      </w:pPr>
+    </w:p>
+    <w:p>
+      <w:pPr>
+        <w:pStyle w:val="Sinespaciado"/>
+        <w:tabs>
+          <w:tab w:val="left" w:leader="hyphen" w:pos="709"/>
+          <w:tab w:val="right" w:leader="hyphen" w:pos="9072"/>
+          <w:tab w:val="right" w:leader="hyphen" w:pos="9129"/>
+        </w:tabs>
+        <w:spacing w:line="360" w:lineRule="auto"/>
+        <w:jc w:val="center"/>
+        <w:rPr>
+          <w:rFonts w:ascii="Arial" w:hAnsi="Arial" w:cs="Arial"/>
+          <w:sz w:val="14"/>
+          <w:szCs w:val="14"/>
+        </w:rPr>
+      </w:pPr>
+    </w:p>
+    <w:p>
+      <w:pPr>
+        <w:pStyle w:val="Sinespaciado"/>
+        <w:tabs>
+          <w:tab w:val="left" w:leader="hyphen" w:pos="709"/>
+          <w:tab w:val="right" w:leader="hyphen" w:pos="9072"/>
+          <w:tab w:val="right" w:leader="hyphen" w:pos="9129"/>
+        </w:tabs>
+        <w:spacing w:line="360" w:lineRule="auto"/>
+        <w:jc w:val="center"/>
+        <w:rPr>
+          <w:rFonts w:ascii="Arial" w:hAnsi="Arial" w:cs="Arial"/>
+          <w:sz w:val="14"/>
+          <w:szCs w:val="14"/>
+        </w:rPr>
+      </w:pPr>
+    </w:p>
+    <w:p>
+      <w:pPr>
+        <w:pStyle w:val="Sinespaciado"/>
+        <w:tabs>
+          <w:tab w:val="right" w:leader="hyphen" w:pos="9129"/>
+        </w:tabs>
+        <w:spacing w:line="360" w:lineRule="auto"/>
+        <w:jc w:val="center"/>
+        <w:rPr>
+          <w:rFonts w:ascii="Arial" w:hAnsi="Arial" w:cs="Arial"/>
+          <w:sz w:val="14"/>
+          <w:szCs w:val="14"/>
+        </w:rPr>
+      </w:pPr>
+      <w:r>
+        <w:rPr>
+          <w:rFonts w:ascii="Arial" w:hAnsi="Arial" w:cs="Arial"/>
+          <w:sz w:val="14"/>
+          <w:szCs w:val="14"/>
+        </w:rPr>
+        <w:t xml:space="preserve">Las notas complementarias se agregan al apéndice de este instrumento con la letra </w:t>
+      </w:r>
+      <w:r>
+        <w:rPr>
+          <w:rFonts w:ascii="Arial" w:hAnsi="Arial" w:cs="Arial"/>
+          <w:b/>
+          <w:bCs/>
+          <w:color w:val="FF0000"/>
+          <w:sz w:val="14"/>
+          <w:szCs w:val="14"/>
+        </w:rPr>
+        <w:t>“D”</w:t>
+      </w:r>
+      <w:r>
+        <w:rPr>
+          <w:rFonts w:ascii="Arial" w:hAnsi="Arial" w:cs="Arial"/>
+          <w:sz w:val="14"/>
+          <w:szCs w:val="14"/>
+        </w:rPr>
+        <w:t>.</w:t>
+      </w:r>
+    </w:p>
+    <w:p>
+      <w:pPr>
+        <w:pStyle w:val="Sinespaciado"/>
+        <w:tabs>
+          <w:tab w:val="left" w:leader="hyphen" w:pos="709"/>
+          <w:tab w:val="right" w:leader="hyphen" w:pos="9072"/>
+          <w:tab w:val="right" w:leader="hyphen" w:pos="9129"/>
+        </w:tabs>
+        <w:spacing w:line="360" w:lineRule="auto"/>
+        <w:jc w:val="center"/>
+        <w:rPr>
+          <w:rFonts w:ascii="Arial" w:hAnsi="Arial" w:cs="Arial"/>
+          <w:sz w:val="14"/>
+          <w:szCs w:val="14"/>
+        </w:rPr>
+      </w:pPr>
+    </w:p>
+    <w:p>
+      <w:pPr>
+        <w:pStyle w:val="Sinespaciado"/>
+        <w:tabs>
+          <w:tab w:val="left" w:leader="hyphen" w:pos="709"/>
+          <w:tab w:val="right" w:leader="hyphen" w:pos="9072"/>
+          <w:tab w:val="right" w:leader="hyphen" w:pos="9129"/>
+        </w:tabs>
+        <w:spacing w:line="360" w:lineRule="auto"/>
+        <w:jc w:val="center"/>
+        <w:rPr>
+          <w:rFonts w:ascii="Arial" w:hAnsi="Arial" w:cs="Arial"/>
+          <w:sz w:val="14"/>
+          <w:szCs w:val="14"/>
+        </w:rPr>
+      </w:pPr>
+    </w:p>
+    <w:p>
+      <w:pPr>
+        <w:tabs>
+          <w:tab w:val="left" w:leader="hyphen" w:pos="709"/>
+          <w:tab w:val="right" w:leader="hyphen" w:pos="9072"/>
+          <w:tab w:val="right" w:leader="hyphen" w:pos="9129"/>
+        </w:tabs>
+        <w:spacing w:line="360" w:lineRule="auto"/>
+        <w:jc w:val="both"/>
+        <w:rPr>
+          <w:rFonts w:ascii="Arial" w:hAnsi="Arial" w:cs="Arial"/>
+          <w:sz w:val="14"/>
+          <w:szCs w:val="14"/>
+        </w:rPr>
+      </w:pPr>
+    </w:p>
+    <w:p>
+      <w:pPr>
+        <w:tabs>
+          <w:tab w:val="left" w:leader="hyphen" w:pos="709"/>
+          <w:tab w:val="right" w:leader="hyphen" w:pos="9072"/>
+          <w:tab w:val="right" w:leader="hyphen" w:pos="9129"/>
+        </w:tabs>
+        <w:spacing w:line="360" w:lineRule="auto"/>
+        <w:jc w:val="both"/>
+        <w:rPr>
+          <w:rFonts w:ascii="Arial" w:hAnsi="Arial" w:cs="Arial"/>
+          <w:sz w:val="14"/>
+          <w:szCs w:val="14"/>
+        </w:rPr>
+      </w:pPr>
+    </w:p>
+    <w:p>
+      <w:pPr>
+        <w:tabs>
+          <w:tab w:val="left" w:leader="hyphen" w:pos="709"/>
+          <w:tab w:val="right" w:leader="hyphen" w:pos="9072"/>
+          <w:tab w:val="right" w:leader="hyphen" w:pos="9129"/>
+        </w:tabs>
+        <w:spacing w:line="360" w:lineRule="auto"/>
+        <w:jc w:val="both"/>
+        <w:rPr>
+          <w:rFonts w:ascii="Arial" w:hAnsi="Arial" w:cs="Arial"/>
+          <w:sz w:val="14"/>
+          <w:szCs w:val="14"/>
+        </w:rPr>
+      </w:pPr>
+    </w:p>
+    <w:p>
+      <w:pPr>
+        <w:pStyle w:val="Sinespaciado"/>
+        <w:tabs>
+          <w:tab w:val="left" w:leader="hyphen" w:pos="709"/>
+          <w:tab w:val="right" w:leader="hyphen" w:pos="9072"/>
+          <w:tab w:val="right" w:leader="hyphen" w:pos="9129"/>
+        </w:tabs>
+        <w:spacing w:line="360" w:lineRule="auto"/>
+        <w:jc w:val="both"/>
+        <w:rPr>
+          <w:rFonts w:ascii="Arial" w:hAnsi="Arial" w:cs="Arial"/>
+          <w:sz w:val="14"/>
+          <w:szCs w:val="14"/>
+        </w:rPr>
+      </w:pPr>
+      <w:r>
+        <w:rPr>
+          <w:rFonts w:ascii="Arial" w:hAnsi="Arial" w:cs="Arial"/>
+          <w:sz w:val="14"/>
+          <w:szCs w:val="14"/>
+        </w:rPr>
+        <w:br w:type="page"/>
+      </w:r>
+    </w:p>
+    <w:p>
+      <w:pPr>
+        <w:pStyle w:val="Sinespaciado"/>
+        <w:tabs>
+          <w:tab w:val="left" w:leader="hyphen" w:pos="709"/>
+          <w:tab w:val="right" w:leader="hyphen" w:pos="9072"/>
+          <w:tab w:val="right" w:leader="hyphen" w:pos="9129"/>
+        </w:tabs>
+        <w:spacing w:line="360" w:lineRule="auto"/>
+        <w:jc w:val="both"/>
+        <w:rPr>
+          <w:rFonts w:ascii="Arial" w:hAnsi="Arial" w:cs="Arial"/>
+          <w:sz w:val="14"/>
+          <w:szCs w:val="14"/>
+        </w:rPr>
+      </w:pPr>
+    </w:p>
+    <w:p>
+      <w:pPr>
+        <w:pStyle w:val="Sinespaciado"/>
+        <w:tabs>
+          <w:tab w:val="left" w:leader="hyphen" w:pos="709"/>
+          <w:tab w:val="right" w:leader="hyphen" w:pos="9072"/>
+          <w:tab w:val="right" w:leader="hyphen" w:pos="9129"/>
+        </w:tabs>
+        <w:spacing w:line="360" w:lineRule="auto"/>
+        <w:jc w:val="both"/>
+        <w:rPr>
+          <w:rFonts w:ascii="Arial" w:hAnsi="Arial" w:cs="Arial"/>
+          <w:sz w:val="14"/>
+          <w:szCs w:val="14"/>
+        </w:rPr>
+      </w:pPr>
+    </w:p>
+    <w:p>
+      <w:pPr>
+        <w:pStyle w:val="Sinespaciado"/>
+        <w:tabs>
+          <w:tab w:val="left" w:leader="hyphen" w:pos="709"/>
+          <w:tab w:val="right" w:leader="hyphen" w:pos="9072"/>
+          <w:tab w:val="right" w:leader="hyphen" w:pos="9129"/>
+        </w:tabs>
+        <w:spacing w:line="360" w:lineRule="auto"/>
+        <w:jc w:val="both"/>
+        <w:rPr>
+          <w:rFonts w:ascii="Arial" w:hAnsi="Arial" w:cs="Arial"/>
+          <w:sz w:val="14"/>
+          <w:szCs w:val="14"/>
+        </w:rPr>
+      </w:pPr>
+    </w:p>
+    <w:p>
+      <w:pPr>
+        <w:tabs>
+          <w:tab w:val="left" w:leader="hyphen" w:pos="709"/>
+          <w:tab w:val="right" w:leader="hyphen" w:pos="9072"/>
+          <w:tab w:val="right" w:leader="hyphen" w:pos="9129"/>
+        </w:tabs>
+        <w:spacing w:line="360" w:lineRule="auto"/>
+        <w:jc w:val="both"/>
+        <w:rPr>
+          <w:rFonts w:ascii="Arial" w:hAnsi="Arial" w:cs="Arial"/>
+          <w:sz w:val="14"/>
+          <w:szCs w:val="14"/>
+        </w:rPr>
+      </w:pPr>
+      <w:r>
+        <w:rPr>
+          <w:rFonts w:ascii="Arial" w:hAnsi="Arial" w:cs="Arial"/>
+          <w:sz w:val="14"/>
+          <w:szCs w:val="14"/>
+        </w:rPr>
+        <w:t xml:space="preserve">-------- </w:t>
+      </w:r>
+      <w:r>
+        <w:rPr>
+          <w:rFonts w:ascii="Arial" w:hAnsi="Arial" w:cs="Arial"/>
+          <w:sz w:val="14"/>
+          <w:szCs w:val="14"/>
+        </w:rPr>
+        <w:t>BENITA HERNÁNDEZ CERÓN</w:t>
+      </w:r>
+      <w:r>
+        <w:rPr>
+          <w:rFonts w:ascii="Arial" w:hAnsi="Arial" w:cs="Arial"/>
+          <w:sz w:val="14"/>
+          <w:szCs w:val="14"/>
+        </w:rPr>
+        <w:t xml:space="preserve">.- FIRMA.- </w:t>
+      </w:r>
+      <w:r>
+        <w:rPr>
+          <w:rFonts w:ascii="Arial" w:hAnsi="Arial" w:cs="Arial"/>
+          <w:sz w:val="14"/>
+          <w:szCs w:val="14"/>
+        </w:rPr>
+        <w:t xml:space="preserve">LICENCIADO </w:t>
+      </w:r>
+      <w:r>
+        <w:rPr>
+          <w:rFonts w:ascii="Arial" w:hAnsi="Arial" w:cs="Arial"/>
+          <w:sz w:val="14"/>
+          <w:szCs w:val="14"/>
+          <w:lang w:val="es-ES" w:eastAsia="es-MX"/>
+        </w:rPr>
+        <w:t>JUAN CARLOS ORTEGA REYES.- FIRMA.- EL SELLO DE AUTORIZAR.</w:t>
+      </w:r>
+      <w:r>
+        <w:rPr>
+          <w:rFonts w:ascii="Arial" w:hAnsi="Arial" w:cs="Arial"/>
+          <w:sz w:val="14"/>
+          <w:szCs w:val="14"/>
+          <w:lang w:val="es-ES" w:eastAsia="es-MX"/>
+        </w:rPr>
+        <w:tab/>
+      </w:r>
+    </w:p>
+    <w:p>
+      <w:pPr>
+        <w:tabs>
+          <w:tab w:val="left" w:leader="hyphen" w:pos="709"/>
+          <w:tab w:val="right" w:leader="hyphen" w:pos="9072"/>
+          <w:tab w:val="right" w:leader="hyphen" w:pos="9129"/>
+        </w:tabs>
+        <w:spacing w:line="360" w:lineRule="auto"/>
+        <w:jc w:val="both"/>
+        <w:rPr>
+          <w:rFonts w:ascii="Arial" w:hAnsi="Arial" w:cs="Arial"/>
+          <w:sz w:val="14"/>
+          <w:szCs w:val="14"/>
+          <w:lang w:val="es-ES"/>
+        </w:rPr>
+      </w:pPr>
+      <w:r>
+        <w:rPr>
+          <w:rFonts w:ascii="Arial" w:hAnsi="Arial" w:cs="Arial"/>
+          <w:sz w:val="14"/>
+          <w:szCs w:val="14"/>
+        </w:rPr>
+        <w:t xml:space="preserve">-------- </w:t>
+      </w:r>
+      <w:r>
+        <w:rPr>
+          <w:rFonts w:ascii="Arial" w:hAnsi="Arial" w:cs="Arial"/>
+          <w:sz w:val="14"/>
+          <w:szCs w:val="14"/>
+        </w:rPr>
+        <w:t>ES</w:t>
+      </w:r>
+      <w:r>
+        <w:rPr>
+          <w:rFonts w:ascii="Arial" w:hAnsi="Arial" w:cs="Arial"/>
+          <w:b/>
+          <w:bCs/>
+          <w:sz w:val="14"/>
+          <w:szCs w:val="14"/>
+        </w:rPr>
+        <w:t xml:space="preserve"> </w:t>
+      </w:r>
+      <w:r>
+        <w:rPr>
+          <w:rFonts w:ascii="Arial" w:hAnsi="Arial" w:cs="Arial"/>
+          <w:b/>
+          <w:bCs/>
+          <w:sz w:val="14"/>
+          <w:szCs w:val="14"/>
+          <w:u w:val="single"/>
+        </w:rPr>
+        <w:t>PRIMER TESTIMONI</w:t>
+      </w:r>
+      <w:r>
+        <w:rPr>
+          <w:rFonts w:ascii="Arial" w:hAnsi="Arial" w:cs="Arial"/>
+          <w:b/>
+          <w:bCs/>
+          <w:sz w:val="14"/>
+          <w:szCs w:val="14"/>
+          <w:u w:val="single"/>
+        </w:rPr>
+        <w:t>O, PR</w:t>
+      </w:r>
+      <w:r>
+        <w:rPr>
+          <w:rFonts w:ascii="Arial" w:hAnsi="Arial" w:cs="Arial"/>
+          <w:b/>
+          <w:bCs/>
+          <w:sz w:val="14"/>
+          <w:szCs w:val="14"/>
+          <w:u w:val="single"/>
+        </w:rPr>
+        <w:t>IMERO EN SU ORDEN</w:t>
+      </w:r>
+      <w:r>
+        <w:rPr>
+          <w:rFonts w:ascii="Arial" w:hAnsi="Arial" w:cs="Arial"/>
+          <w:b/>
+          <w:bCs/>
+          <w:sz w:val="14"/>
+          <w:szCs w:val="14"/>
+        </w:rPr>
+        <w:t xml:space="preserve">, </w:t>
+      </w:r>
+      <w:r>
+        <w:rPr>
+          <w:rFonts w:ascii="Arial" w:hAnsi="Arial" w:cs="Arial"/>
+          <w:sz w:val="14"/>
+          <w:szCs w:val="14"/>
+        </w:rPr>
+        <w:t xml:space="preserve">QUE SE EXPIDE COMO CONSTANCIA PARA LA </w:t>
+      </w:r>
+      <w:r>
+        <w:rPr>
+          <w:rFonts w:ascii="Arial" w:hAnsi="Arial" w:cs="Arial"/>
+          <w:b/>
+          <w:sz w:val="14"/>
+          <w:szCs w:val="14"/>
+          <w:highlight w:val="yellow"/>
+        </w:rPr>
+        <w:t xml:space="preserve">{{ </w:t>
+      </w:r>
+      <w:r>
+        <w:rPr>
+          <w:rFonts w:ascii="Arial" w:hAnsi="Arial" w:cs="Arial"/>
+          <w:b/>
+          <w:sz w:val="14"/>
+          <w:szCs w:val="14"/>
+          <w:highlight w:val="yellow"/>
+          <w:u w:val="single"/>
+        </w:rPr>
+        <w:t>nombre_acreditado</w:t>
+      </w:r>
+      <w:r>
+        <w:rPr>
+          <w:rFonts w:ascii="Arial" w:hAnsi="Arial" w:cs="Arial"/>
+          <w:b/>
+          <w:sz w:val="14"/>
+          <w:szCs w:val="14"/>
+          <w:highlight w:val="yellow"/>
+        </w:rPr>
+        <w:t xml:space="preserve"> }}</w:t>
+      </w:r>
+      <w:r>
+        <w:rPr>
+          <w:rFonts w:ascii="Arial" w:hAnsi="Arial" w:cs="Arial"/>
+          <w:b/>
+          <w:bCs/>
+          <w:sz w:val="14"/>
+          <w:szCs w:val="14"/>
+          <w:lang w:val="es-ES"/>
+        </w:rPr>
+        <w:t xml:space="preserve">, </w:t>
+      </w:r>
+      <w:r>
+        <w:rPr>
+          <w:rFonts w:ascii="Arial" w:hAnsi="Arial" w:cs="Arial"/>
+          <w:sz w:val="14"/>
+          <w:szCs w:val="14"/>
+          <w:lang w:val="es-ES"/>
+        </w:rPr>
+        <w:t xml:space="preserve">CONSTA DE DOS PAGINAS DEBIDAMENTE COTEJADAS Y CORREGIDAS, HUIXQUILUCAN, ESTADO DE MÉXICO, A </w:t>
+      </w:r>
+      <w:r>
+        <w:rPr>
+          <w:rFonts w:ascii="Arial" w:hAnsi="Arial" w:cs="Arial"/>
+          <w:sz w:val="14"/>
+          <w:szCs w:val="14"/>
+          <w:lang w:val="es-ES"/>
+        </w:rPr>
+        <w:t xml:space="preserve">   </w:t>
+      </w:r>
+    </w:p>
+    <w:p>
+      <w:pPr>
+        <w:tabs>
+          <w:tab w:val="left" w:leader="hyphen" w:pos="709"/>
+          <w:tab w:val="right" w:leader="hyphen" w:pos="9072"/>
+          <w:tab w:val="right" w:leader="hyphen" w:pos="9129"/>
+        </w:tabs>
+        <w:spacing w:line="360" w:lineRule="auto"/>
+        <w:jc w:val="both"/>
+        <w:rPr>
+          <w:rFonts w:ascii="Arial" w:hAnsi="Arial" w:cs="Arial"/>
+          <w:sz w:val="14"/>
+          <w:szCs w:val="14"/>
+          <w:lang w:val="es-ES"/>
+        </w:rPr>
+      </w:pPr>
+      <w:r>
+        <w:rPr>
+          <w:rFonts w:ascii="Arial" w:hAnsi="Arial" w:cs="Arial"/>
+          <w:sz w:val="14"/>
+          <w:szCs w:val="14"/>
+          <w:lang w:val="es-ES"/>
+        </w:rPr>
+        <w:t>DEL AÑO DOS MIL VEINTI</w:t>
+      </w:r>
+      <w:r>
+        <w:rPr>
+          <w:rFonts w:ascii="Arial" w:hAnsi="Arial" w:cs="Arial"/>
+          <w:sz w:val="14"/>
+          <w:szCs w:val="14"/>
+          <w:lang w:val="es-ES"/>
+        </w:rPr>
+        <w:t>SÉIS</w:t>
+      </w:r>
+      <w:r>
+        <w:rPr>
+          <w:rFonts w:ascii="Arial" w:hAnsi="Arial" w:cs="Arial"/>
+          <w:sz w:val="14"/>
+          <w:szCs w:val="14"/>
+          <w:lang w:val="es-ES"/>
+        </w:rPr>
+        <w:t>.- DOY FE.</w:t>
+      </w:r>
+      <w:r>
+        <w:rPr>
+          <w:rFonts w:ascii="Arial" w:hAnsi="Arial" w:cs="Arial"/>
+          <w:sz w:val="14"/>
+          <w:szCs w:val="14"/>
+          <w:lang w:val="es-ES"/>
+        </w:rPr>
+        <w:tab/>
+      </w:r>
+    </w:p>
+    <w:p>
+      <w:pPr>
+        <w:tabs>
+          <w:tab w:val="left" w:leader="hyphen" w:pos="709"/>
+          <w:tab w:val="right" w:leader="hyphen" w:pos="9072"/>
+          <w:tab w:val="right" w:leader="hyphen" w:pos="9129"/>
+        </w:tabs>
+        <w:spacing w:line="360" w:lineRule="auto"/>
+        <w:jc w:val="both"/>
+        <w:rPr>
+          <w:rFonts w:ascii="Arial" w:hAnsi="Arial" w:cs="Arial"/>
+          <w:sz w:val="14"/>
+          <w:szCs w:val="14"/>
+          <w:lang w:val="es-ES"/>
+        </w:rPr>
+      </w:pPr>
+      <w:r>
+        <w:rPr>
+          <w:rFonts w:ascii="Arial" w:hAnsi="Arial" w:cs="Arial"/>
+          <w:sz w:val="14"/>
+          <w:szCs w:val="14"/>
+          <w:lang w:val="es-ES"/>
+        </w:rPr>
+        <w:t>EXP.</w:t>
+      </w:r>
+      <w:r>
+        <w:rPr>
+          <w:rFonts w:ascii="Arial" w:hAnsi="Arial" w:cs="Arial"/>
+          <w:sz w:val="14"/>
+          <w:szCs w:val="14"/>
+          <w:lang w:val="es-ES"/>
+        </w:rPr>
+        <w:t>5741</w:t>
+      </w:r>
+      <w:r>
+        <w:rPr>
+          <w:rFonts w:ascii="Arial" w:hAnsi="Arial" w:cs="Arial"/>
+          <w:sz w:val="14"/>
+          <w:szCs w:val="14"/>
+          <w:lang w:val="es-ES"/>
+        </w:rPr>
+        <w:t>-202</w:t>
+      </w:r>
+      <w:r>
+        <w:rPr>
+          <w:rFonts w:ascii="Arial" w:hAnsi="Arial" w:cs="Arial"/>
+          <w:sz w:val="14"/>
+          <w:szCs w:val="14"/>
+          <w:lang w:val="es-ES"/>
+        </w:rPr>
+        <w:t>6</w:t>
+      </w:r>
+    </w:p>
+    <w:p>
+      <w:pPr>
+        <w:tabs>
+          <w:tab w:val="left" w:leader="hyphen" w:pos="709"/>
+          <w:tab w:val="right" w:leader="hyphen" w:pos="9072"/>
+          <w:tab w:val="right" w:leader="hyphen" w:pos="9129"/>
+        </w:tabs>
+        <w:spacing w:line="360" w:lineRule="auto"/>
+        <w:jc w:val="both"/>
+        <w:rPr>
+          <w:rFonts w:ascii="Arial" w:hAnsi="Arial" w:cs="Arial"/>
+          <w:sz w:val="14"/>
+          <w:szCs w:val="14"/>
+          <w:lang w:val="es-ES"/>
+        </w:rPr>
+      </w:pPr>
+      <w:r>
+        <w:rPr>
+          <w:rFonts w:ascii="Arial" w:hAnsi="Arial" w:cs="Arial"/>
+          <w:sz w:val="14"/>
+          <w:szCs w:val="14"/>
+          <w:lang w:val="es-ES"/>
+        </w:rPr>
+        <w:t>JCOR/</w:t>
+      </w:r>
+    </w:p>
+    <w:p>
+      <w:pPr>
+        <w:tabs>
+          <w:tab w:val="left" w:leader="hyphen" w:pos="709"/>
+          <w:tab w:val="right" w:leader="hyphen" w:pos="8222"/>
+        </w:tabs>
+        <w:rPr>
+          <w:rFonts w:ascii="Arial" w:hAnsi="Arial" w:cs="Arial"/>
+        </w:rPr>
+      </w:pPr>
+    </w:p>
+    <w:p>
+      <w:pPr>
+        <w:pStyle w:val="Sinespaciado"/>
+        <w:tabs>
           <w:tab w:val="left" w:leader="hyphen" w:pos="709"/>
           <w:tab w:val="right" w:leader="hyphen" w:pos="8220"/>
         </w:tabs>
         <w:spacing w:line="360" w:lineRule="auto"/>
         <w:jc w:val="both"/>
-        <w:rPr>
-          <w:rFonts w:ascii="Arial" w:hAnsi="Arial" w:cs="Arial"/>
-          <w:bCs/>
-          <w:sz w:val="14"/>
-          <w:szCs w:val="14"/>
-          <w:lang w:val="es-MX"/>
-        </w:rPr>
-      </w:pPr>
-      <w:r>
-        <w:rPr>
-          <w:rFonts w:ascii="Arial" w:hAnsi="Arial" w:cs="Arial"/>
-          <w:sz w:val="14"/>
-          <w:szCs w:val="14"/>
-          <w:lang w:val="es-MX"/>
-        </w:rPr>
-        <w:t xml:space="preserve">-------- </w:t>
-      </w:r>
-      <w:r>
-        <w:rPr>
-          <w:rFonts w:ascii="Arial" w:eastAsia="MS Mincho" w:hAnsi="Arial" w:cs="Arial"/>
-          <w:sz w:val="14"/>
-          <w:szCs w:val="14"/>
-          <w:lang w:val="es-MX"/>
-        </w:rPr>
-        <w:t xml:space="preserve">VI.- Que leí este instrumento al compareciente, a quien le expliqué su valor, fuerza y las consecuencias legales de su contenido, manifestando su conformidad con el mismo, por lo que lo otorga, ratifica y </w:t>
-      </w:r>
-      <w:r>
-        <w:rPr>
-          <w:rFonts w:ascii="Arial" w:hAnsi="Arial" w:cs="Arial"/>
-          <w:sz w:val="14"/>
-          <w:szCs w:val="14"/>
-          <w:lang w:val="es-MX"/>
-        </w:rPr>
-        <w:t xml:space="preserve">firma ante mí el día </w:t>
-      </w:r>
-      <w:r>
-        <w:rPr>
-          <w:rFonts w:ascii="Arial" w:hAnsi="Arial" w:cs="Arial"/>
-          <w:sz w:val="14"/>
-          <w:szCs w:val="14"/>
-          <w:lang w:val="es-MX"/>
-        </w:rPr>
-        <w:t xml:space="preserve">cuatro </w:t>
-      </w:r>
-      <w:r>
-        <w:rPr>
-          <w:rFonts w:ascii="Arial" w:hAnsi="Arial" w:cs="Arial"/>
-          <w:sz w:val="14"/>
-          <w:szCs w:val="14"/>
-          <w:lang w:val="es-MX"/>
-        </w:rPr>
-        <w:t>del mes de</w:t>
-      </w:r>
-      <w:r>
-        <w:rPr>
-          <w:rFonts w:ascii="Arial" w:hAnsi="Arial" w:cs="Arial"/>
-          <w:sz w:val="14"/>
-          <w:szCs w:val="14"/>
-          <w:lang w:val="es-MX"/>
-        </w:rPr>
-        <w:t xml:space="preserve"> </w:t>
-      </w:r>
-      <w:r>
-        <w:rPr>
-          <w:rFonts w:ascii="Arial" w:hAnsi="Arial" w:cs="Arial"/>
-          <w:sz w:val="14"/>
-          <w:szCs w:val="14"/>
-          <w:lang w:val="es-MX"/>
-        </w:rPr>
-        <w:t xml:space="preserve">agosto </w:t>
-      </w:r>
-      <w:r>
-        <w:rPr>
-          <w:rFonts w:ascii="Arial" w:hAnsi="Arial" w:cs="Arial"/>
-          <w:sz w:val="14"/>
-          <w:szCs w:val="14"/>
-          <w:lang w:val="es-MX"/>
-        </w:rPr>
-        <w:t>del año dos mil</w:t>
-      </w:r>
-      <w:r>
-        <w:rPr>
-          <w:rFonts w:ascii="Arial" w:hAnsi="Arial" w:cs="Arial"/>
-          <w:sz w:val="14"/>
-          <w:szCs w:val="14"/>
-          <w:lang w:val="es-MX"/>
-        </w:rPr>
-        <w:t xml:space="preserve"> veinticinco</w:t>
-      </w:r>
-      <w:r>
-        <w:rPr>
-          <w:rFonts w:ascii="Arial" w:hAnsi="Arial" w:cs="Arial"/>
-          <w:sz w:val="14"/>
-          <w:szCs w:val="14"/>
-          <w:lang w:val="es-MX"/>
-        </w:rPr>
-        <w:t>, mismo momento en que lo autorizo definitivamente. - Doy fe.</w:t>
-      </w:r>
-      <w:r>
-        <w:rPr>
-          <w:rFonts w:ascii="Arial" w:hAnsi="Arial" w:cs="Arial"/>
-          <w:sz w:val="14"/>
-          <w:szCs w:val="14"/>
-          <w:lang w:val="es-MX"/>
-        </w:rPr>
-        <w:tab/>
-      </w:r>
-    </w:p>
-    <w:p>
-      <w:pPr>
-        <w:tabs>
-          <w:tab w:val="left" w:leader="hyphen" w:pos="709"/>
-          <w:tab w:val="right" w:leader="hyphen" w:pos="8220"/>
-        </w:tabs>
-        <w:spacing w:line="360" w:lineRule="auto"/>
-        <w:jc w:val="both"/>
-        <w:rPr>
-          <w:rFonts w:ascii="Arial" w:hAnsi="Arial" w:cs="Arial"/>
-          <w:sz w:val="14"/>
-          <w:szCs w:val="14"/>
-        </w:rPr>
-      </w:pPr>
-      <w:r>
-        <w:rPr>
-          <w:rFonts w:ascii="Arial" w:hAnsi="Arial" w:cs="Arial"/>
-          <w:sz w:val="14"/>
-          <w:szCs w:val="14"/>
-        </w:rPr>
-        <w:t xml:space="preserve">---------JOAQUÍN ANDRÉS BORRELL VALENZUELA.- FIRMA.- LICENCIADO </w:t>
-      </w:r>
-      <w:r>
-        <w:rPr>
-          <w:rFonts w:ascii="Arial" w:hAnsi="Arial" w:cs="Arial"/>
-          <w:sz w:val="14"/>
-          <w:szCs w:val="14"/>
-          <w:lang w:eastAsia="es-MX"/>
-        </w:rPr>
-        <w:t>JUAN CARLOS ORTEGA REYES.- FIRMA.- EL SELLO DE AUTORIZAR.</w:t>
-      </w:r>
-      <w:r>
-        <w:rPr>
-          <w:rFonts w:ascii="Arial" w:hAnsi="Arial" w:cs="Arial"/>
-          <w:sz w:val="14"/>
-          <w:szCs w:val="14"/>
-          <w:lang w:eastAsia="es-MX"/>
-        </w:rPr>
-        <w:tab/>
-      </w:r>
-    </w:p>
-    <w:p>
-      <w:pPr>
-        <w:tabs>
-          <w:tab w:val="left" w:leader="hyphen" w:pos="709"/>
-          <w:tab w:val="right" w:leader="hyphen" w:pos="8220"/>
-        </w:tabs>
         <w:rPr>
           <w:rFonts w:ascii="Arial" w:hAnsi="Arial" w:cs="Arial"/>
           <w:sz w:val="14"/>

</xml_diff>

<commit_message>
Se quitó el subrrayado de las palabras a insertar
</commit_message>
<xml_diff>
--- a/backend/templates/plantilla_manera2.docx
+++ b/backend/templates/plantilla_manera2.docx
@@ -123,8 +123,8 @@
         </w:rPr>
         <w:t>VOLUMEN NÚMERO</w:t>
       </w:r>
-      <w:bookmarkStart w:id="0" w:name="_Hlk25759886"/>
-      <w:bookmarkStart w:id="1" w:name="_Hlk30500945"/>
+      <w:bookmarkStart w:id="0" w:name="_Hlk30500945"/>
+      <w:bookmarkStart w:id="1" w:name="_Hlk25759886"/>
       <w:r>
         <w:rPr>
           <w:rFonts w:ascii="Arial" w:hAnsi="Arial" w:cs="Arial"/>
@@ -235,62 +235,62 @@
         </w:rPr>
         <w:t>/</w:t>
       </w:r>
+      <w:bookmarkEnd w:id="0"/>
+      <w:r>
+        <w:rPr>
+          <w:rFonts w:ascii="Arial" w:hAnsi="Arial" w:cs="Arial"/>
+          <w:sz w:val="14"/>
+          <w:szCs w:val="14"/>
+          <w:lang w:val="pt-PT"/>
+        </w:rPr>
+        <w:t>JCOR</w:t>
+      </w:r>
+      <w:r>
+        <w:rPr>
+          <w:rFonts w:ascii="Arial" w:hAnsi="Arial" w:cs="Arial"/>
+          <w:sz w:val="14"/>
+          <w:szCs w:val="14"/>
+          <w:lang w:val="pt-PT"/>
+        </w:rPr>
+        <w:t>/</w:t>
+      </w:r>
+      <w:r>
+        <w:rPr>
+          <w:rFonts w:ascii="Arial" w:hAnsi="Arial" w:cs="Arial"/>
+          <w:sz w:val="14"/>
+          <w:szCs w:val="14"/>
+          <w:lang w:val="pt-PT"/>
+        </w:rPr>
+        <w:t xml:space="preserve">    </w:t>
+      </w:r>
+      <w:r>
+        <w:rPr>
+          <w:rFonts w:ascii="Arial" w:hAnsi="Arial" w:cs="Arial"/>
+          <w:sz w:val="14"/>
+          <w:szCs w:val="14"/>
+          <w:lang w:val="pt-PT"/>
+        </w:rPr>
+        <w:t>/</w:t>
+      </w:r>
+      <w:r>
+        <w:rPr>
+          <w:rFonts w:ascii="Arial" w:hAnsi="Arial" w:cs="Arial"/>
+          <w:sz w:val="14"/>
+          <w:szCs w:val="14"/>
+          <w:lang w:val="pt-PT"/>
+        </w:rPr>
+        <w:t xml:space="preserve">    </w:t>
+      </w:r>
+      <w:r>
+        <w:rPr>
+          <w:rFonts w:ascii="Arial" w:hAnsi="Arial" w:cs="Arial"/>
+          <w:sz w:val="14"/>
+          <w:szCs w:val="14"/>
+          <w:lang w:val="pt-PT"/>
+        </w:rPr>
+        <w:t xml:space="preserve">/    </w:t>
+      </w:r>
       <w:bookmarkEnd w:id="1"/>
-      <w:r>
-        <w:rPr>
-          <w:rFonts w:ascii="Arial" w:hAnsi="Arial" w:cs="Arial"/>
-          <w:sz w:val="14"/>
-          <w:szCs w:val="14"/>
-          <w:lang w:val="pt-PT"/>
-        </w:rPr>
-        <w:t>JCOR</w:t>
-      </w:r>
-      <w:r>
-        <w:rPr>
-          <w:rFonts w:ascii="Arial" w:hAnsi="Arial" w:cs="Arial"/>
-          <w:sz w:val="14"/>
-          <w:szCs w:val="14"/>
-          <w:lang w:val="pt-PT"/>
-        </w:rPr>
-        <w:t>/</w:t>
-      </w:r>
-      <w:r>
-        <w:rPr>
-          <w:rFonts w:ascii="Arial" w:hAnsi="Arial" w:cs="Arial"/>
-          <w:sz w:val="14"/>
-          <w:szCs w:val="14"/>
-          <w:lang w:val="pt-PT"/>
-        </w:rPr>
-        <w:t xml:space="preserve">    </w:t>
-      </w:r>
-      <w:r>
-        <w:rPr>
-          <w:rFonts w:ascii="Arial" w:hAnsi="Arial" w:cs="Arial"/>
-          <w:sz w:val="14"/>
-          <w:szCs w:val="14"/>
-          <w:lang w:val="pt-PT"/>
-        </w:rPr>
-        <w:t>/</w:t>
-      </w:r>
-      <w:r>
-        <w:rPr>
-          <w:rFonts w:ascii="Arial" w:hAnsi="Arial" w:cs="Arial"/>
-          <w:sz w:val="14"/>
-          <w:szCs w:val="14"/>
-          <w:lang w:val="pt-PT"/>
-        </w:rPr>
-        <w:t xml:space="preserve">    </w:t>
-      </w:r>
-      <w:r>
-        <w:rPr>
-          <w:rFonts w:ascii="Arial" w:hAnsi="Arial" w:cs="Arial"/>
-          <w:sz w:val="14"/>
-          <w:szCs w:val="14"/>
-          <w:lang w:val="pt-PT"/>
-        </w:rPr>
-        <w:t xml:space="preserve">/    </w:t>
-      </w:r>
-      <w:bookmarkEnd w:id="0"/>
       <w:r>
         <w:rPr>
           <w:rFonts w:ascii="Arial" w:hAnsi="Arial" w:cs="Arial"/>
@@ -356,8 +356,8 @@
         </w:rPr>
         <w:tab/>
       </w:r>
-      <w:bookmarkStart w:id="2" w:name="_Hlk15562154"/>
-      <w:bookmarkStart w:id="3" w:name="_Hlk43303158"/>
+      <w:bookmarkStart w:id="2" w:name="_Hlk43303158"/>
+      <w:bookmarkStart w:id="3" w:name="_Hlk15562154"/>
     </w:p>
     <w:p>
       <w:pPr>
@@ -549,14 +549,12 @@
         </w:rPr>
         <w:t xml:space="preserve">A FAVOR DE LA SEÑORA </w:t>
       </w:r>
-      <w:proofErr w:type="gramStart"/>
-      <w:r>
-        <w:rPr>
-          <w:rFonts w:ascii="Arial" w:hAnsi="Arial" w:cs="Arial"/>
-          <w:b/>
-          <w:sz w:val="14"/>
-          <w:szCs w:val="14"/>
-          <w:highlight w:val="yellow"/>
+      <w:r>
+        <w:rPr>
+          <w:rFonts w:ascii="Arial" w:hAnsi="Arial" w:cs="Arial"/>
+          <w:b/>
+          <w:sz w:val="14"/>
+          <w:szCs w:val="14"/>
           <w:lang w:val="es-MX"/>
         </w:rPr>
         <w:t xml:space="preserve">{{ </w:t>
@@ -568,66 +566,27 @@
           <w:b/>
           <w:sz w:val="14"/>
           <w:szCs w:val="14"/>
-          <w:highlight w:val="yellow"/>
           <w:lang w:val="es-MX"/>
         </w:rPr>
-        <w:t>nombre</w:t>
-      </w:r>
-      <w:proofErr w:type="gramEnd"/>
-      <w:r>
-        <w:rPr>
-          <w:rFonts w:ascii="Arial" w:hAnsi="Arial" w:cs="Arial"/>
-          <w:b/>
-          <w:sz w:val="14"/>
-          <w:szCs w:val="14"/>
-          <w:highlight w:val="yellow"/>
+        <w:t>nombre_acreditado</w:t>
+      </w:r>
+      <w:proofErr w:type="spellEnd"/>
+      <w:r>
+        <w:rPr>
+          <w:rFonts w:ascii="Arial" w:hAnsi="Arial" w:cs="Arial"/>
+          <w:b/>
+          <w:sz w:val="14"/>
+          <w:szCs w:val="14"/>
           <w:lang w:val="es-MX"/>
         </w:rPr>
-        <w:t>_</w:t>
-      </w:r>
-      <w:proofErr w:type="gramStart"/>
-      <w:r>
-        <w:rPr>
-          <w:rFonts w:ascii="Arial" w:hAnsi="Arial" w:cs="Arial"/>
-          <w:b/>
-          <w:sz w:val="14"/>
-          <w:szCs w:val="14"/>
-          <w:highlight w:val="yellow"/>
-          <w:lang w:val="es-MX"/>
-        </w:rPr>
-        <w:t>acreditado</w:t>
-      </w:r>
-      <w:proofErr w:type="spellEnd"/>
-      <w:r>
-        <w:rPr>
-          <w:rFonts w:ascii="Arial" w:hAnsi="Arial" w:cs="Arial"/>
-          <w:b/>
-          <w:sz w:val="14"/>
-          <w:szCs w:val="14"/>
-          <w:highlight w:val="yellow"/>
-          <w:lang w:val="es-MX"/>
-        </w:rPr>
-        <w:t xml:space="preserve"> }</w:t>
-      </w:r>
-      <w:proofErr w:type="gramEnd"/>
-      <w:r>
-        <w:rPr>
-          <w:rFonts w:ascii="Arial" w:hAnsi="Arial" w:cs="Arial"/>
-          <w:b/>
-          <w:sz w:val="14"/>
-          <w:szCs w:val="14"/>
-          <w:highlight w:val="yellow"/>
-          <w:lang w:val="es-MX"/>
-        </w:rPr>
-        <w:t>}</w:t>
-      </w:r>
-      <w:r>
-        <w:rPr>
-          <w:rFonts w:ascii="Arial" w:hAnsi="Arial" w:cs="Arial"/>
-          <w:b/>
-          <w:sz w:val="14"/>
-          <w:szCs w:val="14"/>
-          <w:lang w:val="es-MX"/>
+        <w:t xml:space="preserve"> }}</w:t>
+      </w:r>
+      <w:r>
+        <w:rPr>
+          <w:rFonts w:ascii="Arial" w:hAnsi="Arial" w:cs="Arial"/>
+          <w:bCs/>
+          <w:sz w:val="14"/>
+          <w:szCs w:val="14"/>
         </w:rPr>
         <w:t xml:space="preserve"> </w:t>
       </w:r>
@@ -638,15 +597,6 @@
           <w:sz w:val="14"/>
           <w:szCs w:val="14"/>
         </w:rPr>
-        <w:t xml:space="preserve"> </w:t>
-      </w:r>
-      <w:r>
-        <w:rPr>
-          <w:rFonts w:ascii="Arial" w:hAnsi="Arial" w:cs="Arial"/>
-          <w:bCs/>
-          <w:sz w:val="14"/>
-          <w:szCs w:val="14"/>
-        </w:rPr>
         <w:t>EN LO SUCESIVO “</w:t>
       </w:r>
       <w:r>
@@ -705,7 +655,7 @@
         </w:rPr>
         <w:tab/>
       </w:r>
-      <w:bookmarkEnd w:id="3"/>
+      <w:bookmarkEnd w:id="2"/>
     </w:p>
     <w:p>
       <w:pPr>
@@ -970,7 +920,7 @@
         <w:t>--------------------------------------------------------------------------------------------------------------------------------------------------------------------------------------</w:t>
       </w:r>
     </w:p>
-    <w:bookmarkEnd w:id="2"/>
+    <w:bookmarkEnd w:id="3"/>
     <w:p>
       <w:pPr>
         <w:pStyle w:val="Sinespaciado"/>
@@ -1394,7 +1344,6 @@
         </w:rPr>
         <w:t xml:space="preserve">OTORGAMIENTO DE CRÉDITO Y CONSTITUCIÓN DE GARANTÍA </w:t>
       </w:r>
-      <w:proofErr w:type="gramStart"/>
       <w:r>
         <w:rPr>
           <w:rFonts w:ascii="Arial" w:eastAsia="Batang" w:hAnsi="Arial" w:cs="Arial"/>
@@ -1412,18 +1361,8 @@
           <w:sz w:val="14"/>
           <w:szCs w:val="14"/>
         </w:rPr>
-        <w:t>.</w:t>
-      </w:r>
-      <w:r>
-        <w:rPr>
-          <w:rFonts w:ascii="Arial" w:eastAsia="Batang" w:hAnsi="Arial" w:cs="Arial"/>
-          <w:b/>
-          <w:sz w:val="14"/>
-          <w:szCs w:val="14"/>
-        </w:rPr>
-        <w:t>-</w:t>
-      </w:r>
-      <w:proofErr w:type="gramEnd"/>
+        <w:t>. -</w:t>
+      </w:r>
       <w:r>
         <w:rPr>
           <w:rFonts w:ascii="Arial" w:eastAsia="Batang" w:hAnsi="Arial" w:cs="Arial"/>
@@ -1473,13 +1412,13 @@
         </w:rPr>
         <w:t xml:space="preserve"> </w:t>
       </w:r>
-      <w:proofErr w:type="gramStart"/>
-      <w:r>
-        <w:rPr>
-          <w:rFonts w:ascii="Arial" w:eastAsia="Batang" w:hAnsi="Arial" w:cs="Arial"/>
-          <w:sz w:val="14"/>
-          <w:szCs w:val="14"/>
-          <w:highlight w:val="yellow"/>
+      <w:r>
+        <w:rPr>
+          <w:rFonts w:ascii="Arial" w:eastAsia="Batang" w:hAnsi="Arial" w:cs="Arial"/>
+          <w:b/>
+          <w:bCs/>
+          <w:sz w:val="14"/>
+          <w:szCs w:val="14"/>
           <w:lang w:val="es-MX"/>
         </w:rPr>
         <w:t xml:space="preserve">{{ </w:t>
@@ -1488,56 +1427,420 @@
       <w:r>
         <w:rPr>
           <w:rFonts w:ascii="Arial" w:eastAsia="Batang" w:hAnsi="Arial" w:cs="Arial"/>
-          <w:sz w:val="14"/>
-          <w:szCs w:val="14"/>
-          <w:highlight w:val="yellow"/>
+          <w:b/>
+          <w:bCs/>
+          <w:sz w:val="14"/>
+          <w:szCs w:val="14"/>
           <w:lang w:val="es-MX"/>
         </w:rPr>
-        <w:t>numero</w:t>
-      </w:r>
-      <w:proofErr w:type="gramEnd"/>
-      <w:r>
-        <w:rPr>
-          <w:rFonts w:ascii="Arial" w:eastAsia="Batang" w:hAnsi="Arial" w:cs="Arial"/>
-          <w:sz w:val="14"/>
-          <w:szCs w:val="14"/>
-          <w:highlight w:val="yellow"/>
+        <w:t>numero_carta</w:t>
+      </w:r>
+      <w:proofErr w:type="spellEnd"/>
+      <w:r>
+        <w:rPr>
+          <w:rFonts w:ascii="Arial" w:eastAsia="Batang" w:hAnsi="Arial" w:cs="Arial"/>
+          <w:b/>
+          <w:bCs/>
+          <w:sz w:val="14"/>
+          <w:szCs w:val="14"/>
           <w:lang w:val="es-MX"/>
         </w:rPr>
-        <w:t>_</w:t>
-      </w:r>
-      <w:proofErr w:type="gramStart"/>
-      <w:r>
-        <w:rPr>
-          <w:rFonts w:ascii="Arial" w:eastAsia="Batang" w:hAnsi="Arial" w:cs="Arial"/>
-          <w:sz w:val="14"/>
-          <w:szCs w:val="14"/>
-          <w:highlight w:val="yellow"/>
+        <w:t xml:space="preserve"> }}</w:t>
+      </w:r>
+      <w:r>
+        <w:rPr>
+          <w:rFonts w:ascii="Arial" w:eastAsia="Batang" w:hAnsi="Arial" w:cs="Arial"/>
+          <w:sz w:val="14"/>
+          <w:szCs w:val="14"/>
+        </w:rPr>
+        <w:t xml:space="preserve"> </w:t>
+      </w:r>
+      <w:r>
+        <w:rPr>
+          <w:rFonts w:ascii="Arial" w:eastAsia="Batang" w:hAnsi="Arial" w:cs="Arial"/>
+          <w:sz w:val="14"/>
+          <w:szCs w:val="14"/>
+        </w:rPr>
+        <w:t>,</w:t>
+      </w:r>
+      <w:r>
+        <w:rPr>
+          <w:rFonts w:ascii="Arial" w:eastAsia="Batang" w:hAnsi="Arial" w:cs="Arial"/>
+          <w:sz w:val="14"/>
+          <w:szCs w:val="14"/>
+        </w:rPr>
+        <w:t xml:space="preserve"> </w:t>
+      </w:r>
+      <w:r>
+        <w:rPr>
+          <w:rFonts w:ascii="Arial" w:eastAsia="Batang" w:hAnsi="Arial" w:cs="Arial"/>
+          <w:sz w:val="14"/>
+          <w:szCs w:val="14"/>
+        </w:rPr>
+        <w:t>de fecha</w:t>
+      </w:r>
+      <w:r>
+        <w:rPr>
+          <w:rFonts w:ascii="Arial" w:eastAsia="Batang" w:hAnsi="Arial" w:cs="Arial"/>
+          <w:sz w:val="14"/>
+          <w:szCs w:val="14"/>
+        </w:rPr>
+        <w:t xml:space="preserve"> </w:t>
+      </w:r>
+      <w:r>
+        <w:rPr>
+          <w:rFonts w:ascii="Arial" w:eastAsia="Batang" w:hAnsi="Arial" w:cs="Arial"/>
+          <w:sz w:val="14"/>
+          <w:szCs w:val="14"/>
           <w:lang w:val="es-MX"/>
         </w:rPr>
-        <w:t>carta</w:t>
+        <w:t>{{ fecha }}</w:t>
+      </w:r>
+      <w:r>
+        <w:rPr>
+          <w:rFonts w:ascii="Arial" w:eastAsia="Batang" w:hAnsi="Arial" w:cs="Arial"/>
+          <w:sz w:val="14"/>
+          <w:szCs w:val="14"/>
+        </w:rPr>
+        <w:t>,</w:t>
+      </w:r>
+      <w:bookmarkStart w:id="4" w:name="_Hlk150194100"/>
+      <w:r>
+        <w:rPr>
+          <w:rFonts w:ascii="Arial" w:eastAsia="Batang" w:hAnsi="Arial" w:cs="Arial"/>
+          <w:sz w:val="14"/>
+          <w:szCs w:val="14"/>
+        </w:rPr>
+        <w:t xml:space="preserve"> </w:t>
+      </w:r>
+      <w:r>
+        <w:rPr>
+          <w:rFonts w:ascii="Arial" w:eastAsia="Batang" w:hAnsi="Arial" w:cs="Arial"/>
+          <w:sz w:val="14"/>
+          <w:szCs w:val="14"/>
+          <w:lang w:val="es-ES"/>
+        </w:rPr>
+        <w:t>otorgado ante</w:t>
+      </w:r>
+      <w:bookmarkEnd w:id="4"/>
+      <w:r>
+        <w:rPr>
+          <w:rFonts w:ascii="Arial" w:eastAsia="Batang" w:hAnsi="Arial" w:cs="Arial"/>
+          <w:sz w:val="14"/>
+          <w:szCs w:val="14"/>
+          <w:lang w:val="es-ES"/>
+        </w:rPr>
+        <w:t xml:space="preserve"> la fe del Licenciado</w:t>
+      </w:r>
+      <w:r>
+        <w:rPr>
+          <w:rFonts w:ascii="Arial" w:eastAsia="Batang" w:hAnsi="Arial" w:cs="Arial"/>
+          <w:sz w:val="14"/>
+          <w:szCs w:val="14"/>
+          <w:lang w:val="es-ES"/>
+        </w:rPr>
+        <w:t xml:space="preserve"> </w:t>
+      </w:r>
+      <w:r>
+        <w:rPr>
+          <w:rFonts w:ascii="Arial" w:eastAsia="Batang" w:hAnsi="Arial" w:cs="Arial"/>
+          <w:bCs/>
+          <w:sz w:val="14"/>
+          <w:szCs w:val="14"/>
+          <w:lang w:val="es-MX"/>
+        </w:rPr>
+        <w:t xml:space="preserve">{{ </w:t>
+      </w:r>
+      <w:proofErr w:type="spellStart"/>
+      <w:r>
+        <w:rPr>
+          <w:rFonts w:ascii="Arial" w:eastAsia="Batang" w:hAnsi="Arial" w:cs="Arial"/>
+          <w:bCs/>
+          <w:sz w:val="14"/>
+          <w:szCs w:val="14"/>
+          <w:lang w:val="es-MX"/>
+        </w:rPr>
+        <w:t>nombre_notario</w:t>
       </w:r>
       <w:proofErr w:type="spellEnd"/>
       <w:r>
         <w:rPr>
           <w:rFonts w:ascii="Arial" w:eastAsia="Batang" w:hAnsi="Arial" w:cs="Arial"/>
-          <w:sz w:val="14"/>
-          <w:szCs w:val="14"/>
-          <w:highlight w:val="yellow"/>
+          <w:bCs/>
+          <w:sz w:val="14"/>
+          <w:szCs w:val="14"/>
           <w:lang w:val="es-MX"/>
         </w:rPr>
-        <w:t xml:space="preserve"> }</w:t>
-      </w:r>
-      <w:proofErr w:type="gramEnd"/>
-      <w:r>
-        <w:rPr>
-          <w:rFonts w:ascii="Arial" w:eastAsia="Batang" w:hAnsi="Arial" w:cs="Arial"/>
-          <w:sz w:val="14"/>
-          <w:szCs w:val="14"/>
-          <w:highlight w:val="yellow"/>
+        <w:t xml:space="preserve"> }}</w:t>
+      </w:r>
+      <w:r>
+        <w:rPr>
+          <w:rFonts w:ascii="Arial" w:eastAsia="Batang" w:hAnsi="Arial" w:cs="Arial"/>
+          <w:sz w:val="14"/>
+          <w:szCs w:val="14"/>
+        </w:rPr>
+        <w:t>,</w:t>
+      </w:r>
+      <w:r>
+        <w:rPr>
+          <w:rFonts w:ascii="Arial" w:eastAsia="Batang" w:hAnsi="Arial" w:cs="Arial"/>
+          <w:sz w:val="14"/>
+          <w:szCs w:val="14"/>
+        </w:rPr>
+        <w:t xml:space="preserve"> </w:t>
+      </w:r>
+      <w:r>
+        <w:rPr>
+          <w:rFonts w:ascii="Arial" w:eastAsia="Batang" w:hAnsi="Arial" w:cs="Arial"/>
+          <w:sz w:val="14"/>
+          <w:szCs w:val="14"/>
+        </w:rPr>
+        <w:t xml:space="preserve">se hizo constar </w:t>
+      </w:r>
+      <w:r>
+        <w:rPr>
+          <w:rFonts w:ascii="Arial" w:eastAsia="Batang" w:hAnsi="Arial" w:cs="Arial"/>
+          <w:sz w:val="14"/>
+          <w:szCs w:val="14"/>
+        </w:rPr>
+        <w:t>entre otros actos</w:t>
+      </w:r>
+      <w:r>
+        <w:rPr>
+          <w:rFonts w:ascii="Arial" w:eastAsia="Batang" w:hAnsi="Arial" w:cs="Arial"/>
+          <w:sz w:val="14"/>
+          <w:szCs w:val="14"/>
+        </w:rPr>
+        <w:t>,</w:t>
+      </w:r>
+      <w:r>
+        <w:rPr>
+          <w:rFonts w:ascii="Arial" w:eastAsia="Batang" w:hAnsi="Arial" w:cs="Arial"/>
+          <w:sz w:val="14"/>
+          <w:szCs w:val="14"/>
+        </w:rPr>
+        <w:t xml:space="preserve"> </w:t>
+      </w:r>
+      <w:r>
+        <w:rPr>
+          <w:rFonts w:ascii="Arial" w:eastAsia="Batang" w:hAnsi="Arial" w:cs="Arial"/>
+          <w:bCs/>
+          <w:sz w:val="14"/>
+          <w:szCs w:val="14"/>
+        </w:rPr>
+        <w:t xml:space="preserve">el </w:t>
+      </w:r>
+      <w:r>
+        <w:rPr>
+          <w:rFonts w:ascii="Arial" w:eastAsia="Batang" w:hAnsi="Arial" w:cs="Arial"/>
+          <w:bCs/>
+          <w:sz w:val="14"/>
+          <w:szCs w:val="14"/>
+        </w:rPr>
+        <w:t>otorgamiento de crédito y constitución de garantía hipotecaria</w:t>
+      </w:r>
+      <w:r>
+        <w:rPr>
+          <w:rFonts w:ascii="Arial" w:eastAsia="Batang" w:hAnsi="Arial" w:cs="Arial"/>
+          <w:bCs/>
+          <w:sz w:val="14"/>
+          <w:szCs w:val="14"/>
+        </w:rPr>
+        <w:t>,</w:t>
+      </w:r>
+      <w:r>
+        <w:rPr>
+          <w:rFonts w:ascii="Arial" w:eastAsia="Batang" w:hAnsi="Arial" w:cs="Arial"/>
+          <w:b/>
+          <w:sz w:val="14"/>
+          <w:szCs w:val="14"/>
+        </w:rPr>
+        <w:t xml:space="preserve"> </w:t>
+      </w:r>
+      <w:r>
+        <w:rPr>
+          <w:rFonts w:ascii="Arial" w:eastAsia="Batang" w:hAnsi="Arial" w:cs="Arial"/>
+          <w:sz w:val="14"/>
+          <w:szCs w:val="14"/>
+        </w:rPr>
+        <w:t>por medio del cual</w:t>
+      </w:r>
+      <w:r>
+        <w:rPr>
+          <w:rFonts w:ascii="Arial" w:eastAsia="Batang" w:hAnsi="Arial" w:cs="Arial"/>
+          <w:sz w:val="14"/>
+          <w:szCs w:val="14"/>
+        </w:rPr>
+        <w:t xml:space="preserve"> el</w:t>
+      </w:r>
+      <w:r>
+        <w:rPr>
+          <w:rFonts w:ascii="Arial" w:eastAsia="Batang" w:hAnsi="Arial" w:cs="Arial"/>
+          <w:sz w:val="14"/>
+          <w:szCs w:val="14"/>
+        </w:rPr>
+        <w:t xml:space="preserve"> </w:t>
+      </w:r>
+      <w:r>
+        <w:rPr>
+          <w:rFonts w:ascii="Arial" w:eastAsia="Batang" w:hAnsi="Arial" w:cs="Arial"/>
+          <w:b/>
+          <w:sz w:val="14"/>
+          <w:szCs w:val="14"/>
+        </w:rPr>
+        <w:t xml:space="preserve">INSTITUTO DEL FONDO NACIONAL </w:t>
+      </w:r>
+      <w:r>
+        <w:rPr>
+          <w:rFonts w:ascii="Arial" w:eastAsia="Batang" w:hAnsi="Arial" w:cs="Arial"/>
+          <w:b/>
+          <w:sz w:val="14"/>
+          <w:szCs w:val="14"/>
+        </w:rPr>
+        <w:t xml:space="preserve">DE LA VIVIENDA </w:t>
+      </w:r>
+      <w:r>
+        <w:rPr>
+          <w:rFonts w:ascii="Arial" w:eastAsia="Batang" w:hAnsi="Arial" w:cs="Arial"/>
+          <w:b/>
+          <w:sz w:val="14"/>
+          <w:szCs w:val="14"/>
+        </w:rPr>
+        <w:t>PARA LOS TRABAJADORES</w:t>
+      </w:r>
+      <w:r>
+        <w:rPr>
+          <w:rFonts w:ascii="Arial" w:eastAsia="Batang" w:hAnsi="Arial" w:cs="Arial"/>
+          <w:sz w:val="14"/>
+          <w:szCs w:val="14"/>
+        </w:rPr>
+        <w:t>,</w:t>
+      </w:r>
+      <w:r>
+        <w:rPr>
+          <w:rFonts w:ascii="Arial" w:eastAsia="Batang" w:hAnsi="Arial" w:cs="Arial"/>
+          <w:b/>
+          <w:sz w:val="14"/>
+          <w:szCs w:val="14"/>
+        </w:rPr>
+        <w:t xml:space="preserve"> </w:t>
+      </w:r>
+      <w:r>
+        <w:rPr>
+          <w:rFonts w:ascii="Arial" w:eastAsia="Batang" w:hAnsi="Arial" w:cs="Arial"/>
+          <w:sz w:val="14"/>
+          <w:szCs w:val="14"/>
+        </w:rPr>
+        <w:t>otorg</w:t>
+      </w:r>
+      <w:r>
+        <w:rPr>
+          <w:rFonts w:ascii="Arial" w:eastAsia="Batang" w:hAnsi="Arial" w:cs="Arial"/>
+          <w:sz w:val="14"/>
+          <w:szCs w:val="14"/>
+        </w:rPr>
+        <w:t>ó</w:t>
+      </w:r>
+      <w:r>
+        <w:rPr>
+          <w:rFonts w:ascii="Arial" w:eastAsia="Batang" w:hAnsi="Arial" w:cs="Arial"/>
+          <w:sz w:val="14"/>
+          <w:szCs w:val="14"/>
+        </w:rPr>
+        <w:t xml:space="preserve"> </w:t>
+      </w:r>
+      <w:r>
+        <w:rPr>
+          <w:rFonts w:ascii="Arial" w:eastAsia="Batang" w:hAnsi="Arial" w:cs="Arial"/>
+          <w:sz w:val="14"/>
+          <w:szCs w:val="14"/>
+        </w:rPr>
+        <w:t xml:space="preserve">a la </w:t>
+      </w:r>
+      <w:r>
+        <w:rPr>
+          <w:rFonts w:ascii="Arial" w:eastAsia="Batang" w:hAnsi="Arial" w:cs="Arial"/>
+          <w:sz w:val="14"/>
+          <w:szCs w:val="14"/>
+        </w:rPr>
+        <w:t>señor</w:t>
+      </w:r>
+      <w:r>
+        <w:rPr>
+          <w:rFonts w:ascii="Arial" w:eastAsia="Batang" w:hAnsi="Arial" w:cs="Arial"/>
+          <w:sz w:val="14"/>
+          <w:szCs w:val="14"/>
+        </w:rPr>
+        <w:t>a</w:t>
+      </w:r>
+      <w:r>
+        <w:rPr>
+          <w:rFonts w:ascii="Arial" w:hAnsi="Arial" w:cs="Arial"/>
+          <w:b/>
+          <w:bCs/>
+          <w:sz w:val="14"/>
+          <w:szCs w:val="14"/>
+          <w:lang w:val="es-ES"/>
+        </w:rPr>
+        <w:t xml:space="preserve"> </w:t>
+      </w:r>
+      <w:r>
+        <w:rPr>
+          <w:rFonts w:ascii="Arial" w:hAnsi="Arial" w:cs="Arial"/>
+          <w:b/>
+          <w:sz w:val="14"/>
+          <w:szCs w:val="14"/>
           <w:lang w:val="es-MX"/>
         </w:rPr>
-        <w:t>}</w:t>
+        <w:t xml:space="preserve">{{ </w:t>
+      </w:r>
+      <w:proofErr w:type="spellStart"/>
+      <w:r>
+        <w:rPr>
+          <w:rFonts w:ascii="Arial" w:hAnsi="Arial" w:cs="Arial"/>
+          <w:b/>
+          <w:sz w:val="14"/>
+          <w:szCs w:val="14"/>
+          <w:lang w:val="es-MX"/>
+        </w:rPr>
+        <w:t>nombre_acreditado</w:t>
+      </w:r>
+      <w:proofErr w:type="spellEnd"/>
+      <w:r>
+        <w:rPr>
+          <w:rFonts w:ascii="Arial" w:hAnsi="Arial" w:cs="Arial"/>
+          <w:b/>
+          <w:sz w:val="14"/>
+          <w:szCs w:val="14"/>
+          <w:lang w:val="es-MX"/>
+        </w:rPr>
+        <w:t xml:space="preserve"> }}</w:t>
+      </w:r>
+      <w:r>
+        <w:rPr>
+          <w:rFonts w:ascii="Arial" w:hAnsi="Arial" w:cs="Arial"/>
+          <w:bCs/>
+          <w:sz w:val="14"/>
+          <w:szCs w:val="14"/>
+        </w:rPr>
+        <w:t xml:space="preserve">, </w:t>
+      </w:r>
+      <w:r>
+        <w:rPr>
+          <w:rFonts w:ascii="Arial" w:eastAsia="Batang" w:hAnsi="Arial" w:cs="Arial"/>
+          <w:bCs/>
+          <w:sz w:val="14"/>
+          <w:szCs w:val="14"/>
+        </w:rPr>
+        <w:t xml:space="preserve">un crédito </w:t>
+      </w:r>
+      <w:r>
+        <w:rPr>
+          <w:rFonts w:ascii="Arial" w:eastAsia="Batang" w:hAnsi="Arial" w:cs="Arial"/>
+          <w:sz w:val="14"/>
+          <w:szCs w:val="14"/>
+        </w:rPr>
+        <w:t>hasta</w:t>
       </w:r>
       <w:r>
         <w:rPr>
@@ -1553,505 +1856,33 @@
           <w:sz w:val="14"/>
           <w:szCs w:val="14"/>
         </w:rPr>
-        <w:t>,</w:t>
-      </w:r>
-      <w:r>
-        <w:rPr>
-          <w:rFonts w:ascii="Arial" w:eastAsia="Batang" w:hAnsi="Arial" w:cs="Arial"/>
-          <w:sz w:val="14"/>
-          <w:szCs w:val="14"/>
-        </w:rPr>
-        <w:t xml:space="preserve"> </w:t>
-      </w:r>
-      <w:r>
-        <w:rPr>
-          <w:rFonts w:ascii="Arial" w:eastAsia="Batang" w:hAnsi="Arial" w:cs="Arial"/>
-          <w:sz w:val="14"/>
-          <w:szCs w:val="14"/>
-        </w:rPr>
-        <w:t>de fecha</w:t>
-      </w:r>
-      <w:r>
-        <w:rPr>
-          <w:rFonts w:ascii="Arial" w:eastAsia="Batang" w:hAnsi="Arial" w:cs="Arial"/>
-          <w:sz w:val="14"/>
-          <w:szCs w:val="14"/>
-        </w:rPr>
-        <w:t xml:space="preserve"> </w:t>
-      </w:r>
-      <w:proofErr w:type="gramStart"/>
-      <w:r>
-        <w:rPr>
-          <w:rFonts w:ascii="Arial" w:eastAsia="Batang" w:hAnsi="Arial" w:cs="Arial"/>
-          <w:sz w:val="14"/>
-          <w:szCs w:val="14"/>
-          <w:highlight w:val="yellow"/>
-          <w:lang w:val="es-MX"/>
-        </w:rPr>
-        <w:t xml:space="preserve">{{ </w:t>
-      </w:r>
-      <w:r>
-        <w:rPr>
-          <w:rFonts w:ascii="Arial" w:eastAsia="Batang" w:hAnsi="Arial" w:cs="Arial"/>
-          <w:sz w:val="14"/>
-          <w:szCs w:val="14"/>
-          <w:highlight w:val="yellow"/>
-          <w:lang w:val="es-MX"/>
-        </w:rPr>
-        <w:t>fecha</w:t>
-      </w:r>
-      <w:proofErr w:type="gramEnd"/>
-      <w:r>
-        <w:rPr>
-          <w:rFonts w:ascii="Arial" w:eastAsia="Batang" w:hAnsi="Arial" w:cs="Arial"/>
-          <w:sz w:val="14"/>
-          <w:szCs w:val="14"/>
-          <w:highlight w:val="yellow"/>
-          <w:lang w:val="es-MX"/>
+        <w:t>por</w:t>
+      </w:r>
+      <w:r>
+        <w:rPr>
+          <w:rFonts w:ascii="Arial" w:eastAsia="Batang" w:hAnsi="Arial" w:cs="Arial"/>
+          <w:sz w:val="14"/>
+          <w:szCs w:val="14"/>
+        </w:rPr>
+        <w:t xml:space="preserve"> {{ </w:t>
+      </w:r>
+      <w:proofErr w:type="spellStart"/>
+      <w:r>
+        <w:rPr>
+          <w:rFonts w:ascii="Arial" w:eastAsia="Batang" w:hAnsi="Arial" w:cs="Arial"/>
+          <w:sz w:val="14"/>
+          <w:szCs w:val="14"/>
+        </w:rPr>
+        <w:t>crédito_a_salario</w:t>
+      </w:r>
+      <w:proofErr w:type="spellEnd"/>
+      <w:r>
+        <w:rPr>
+          <w:rFonts w:ascii="Arial" w:eastAsia="Batang" w:hAnsi="Arial" w:cs="Arial"/>
+          <w:sz w:val="14"/>
+          <w:szCs w:val="14"/>
         </w:rPr>
         <w:t xml:space="preserve"> }}</w:t>
-      </w:r>
-      <w:r>
-        <w:rPr>
-          <w:rFonts w:ascii="Arial" w:eastAsia="Batang" w:hAnsi="Arial" w:cs="Arial"/>
-          <w:sz w:val="14"/>
-          <w:szCs w:val="14"/>
-        </w:rPr>
-        <w:t>,</w:t>
-      </w:r>
-      <w:bookmarkStart w:id="4" w:name="_Hlk150194100"/>
-      <w:r>
-        <w:rPr>
-          <w:rFonts w:ascii="Arial" w:eastAsia="Batang" w:hAnsi="Arial" w:cs="Arial"/>
-          <w:sz w:val="14"/>
-          <w:szCs w:val="14"/>
-        </w:rPr>
-        <w:t xml:space="preserve"> </w:t>
-      </w:r>
-      <w:r>
-        <w:rPr>
-          <w:rFonts w:ascii="Arial" w:eastAsia="Batang" w:hAnsi="Arial" w:cs="Arial"/>
-          <w:sz w:val="14"/>
-          <w:szCs w:val="14"/>
-          <w:lang w:val="es-ES"/>
-        </w:rPr>
-        <w:t>otorgado ante</w:t>
-      </w:r>
-      <w:bookmarkEnd w:id="4"/>
-      <w:r>
-        <w:rPr>
-          <w:rFonts w:ascii="Arial" w:eastAsia="Batang" w:hAnsi="Arial" w:cs="Arial"/>
-          <w:sz w:val="14"/>
-          <w:szCs w:val="14"/>
-          <w:lang w:val="es-ES"/>
-        </w:rPr>
-        <w:t xml:space="preserve"> la fe del Licenciado</w:t>
-      </w:r>
-      <w:r>
-        <w:rPr>
-          <w:rFonts w:ascii="Arial" w:eastAsia="Batang" w:hAnsi="Arial" w:cs="Arial"/>
-          <w:sz w:val="14"/>
-          <w:szCs w:val="14"/>
-          <w:lang w:val="es-ES"/>
-        </w:rPr>
-        <w:t xml:space="preserve"> </w:t>
-      </w:r>
-      <w:proofErr w:type="gramStart"/>
-      <w:r>
-        <w:rPr>
-          <w:rFonts w:ascii="Arial" w:eastAsia="Batang" w:hAnsi="Arial" w:cs="Arial"/>
-          <w:bCs/>
-          <w:sz w:val="14"/>
-          <w:szCs w:val="14"/>
-          <w:highlight w:val="yellow"/>
-          <w:lang w:val="es-MX"/>
-        </w:rPr>
-        <w:t xml:space="preserve">{{ </w:t>
-      </w:r>
-      <w:proofErr w:type="spellStart"/>
-      <w:r>
-        <w:rPr>
-          <w:rFonts w:ascii="Arial" w:eastAsia="Batang" w:hAnsi="Arial" w:cs="Arial"/>
-          <w:bCs/>
-          <w:sz w:val="14"/>
-          <w:szCs w:val="14"/>
-          <w:highlight w:val="yellow"/>
-          <w:lang w:val="es-MX"/>
-        </w:rPr>
-        <w:t>nombre</w:t>
-      </w:r>
-      <w:proofErr w:type="gramEnd"/>
-      <w:r>
-        <w:rPr>
-          <w:rFonts w:ascii="Arial" w:eastAsia="Batang" w:hAnsi="Arial" w:cs="Arial"/>
-          <w:bCs/>
-          <w:sz w:val="14"/>
-          <w:szCs w:val="14"/>
-          <w:highlight w:val="yellow"/>
-          <w:lang w:val="es-MX"/>
-        </w:rPr>
-        <w:t>_</w:t>
-      </w:r>
-      <w:proofErr w:type="gramStart"/>
-      <w:r>
-        <w:rPr>
-          <w:rFonts w:ascii="Arial" w:eastAsia="Batang" w:hAnsi="Arial" w:cs="Arial"/>
-          <w:bCs/>
-          <w:sz w:val="14"/>
-          <w:szCs w:val="14"/>
-          <w:highlight w:val="yellow"/>
-          <w:lang w:val="es-MX"/>
-        </w:rPr>
-        <w:t>notario</w:t>
-      </w:r>
-      <w:proofErr w:type="spellEnd"/>
-      <w:r>
-        <w:rPr>
-          <w:rFonts w:ascii="Arial" w:eastAsia="Batang" w:hAnsi="Arial" w:cs="Arial"/>
-          <w:bCs/>
-          <w:sz w:val="14"/>
-          <w:szCs w:val="14"/>
-          <w:highlight w:val="yellow"/>
-          <w:lang w:val="es-MX"/>
-        </w:rPr>
-        <w:t xml:space="preserve"> }</w:t>
-      </w:r>
-      <w:proofErr w:type="gramEnd"/>
-      <w:r>
-        <w:rPr>
-          <w:rFonts w:ascii="Arial" w:eastAsia="Batang" w:hAnsi="Arial" w:cs="Arial"/>
-          <w:bCs/>
-          <w:sz w:val="14"/>
-          <w:szCs w:val="14"/>
-          <w:highlight w:val="yellow"/>
-          <w:lang w:val="es-MX"/>
-        </w:rPr>
-        <w:t>}</w:t>
-      </w:r>
-      <w:r>
-        <w:rPr>
-          <w:rFonts w:ascii="Arial" w:eastAsia="Batang" w:hAnsi="Arial" w:cs="Arial"/>
-          <w:sz w:val="14"/>
-          <w:szCs w:val="14"/>
-        </w:rPr>
-        <w:t>,</w:t>
-      </w:r>
-      <w:r>
-        <w:rPr>
-          <w:rFonts w:ascii="Arial" w:eastAsia="Batang" w:hAnsi="Arial" w:cs="Arial"/>
-          <w:sz w:val="14"/>
-          <w:szCs w:val="14"/>
-        </w:rPr>
-        <w:t xml:space="preserve"> </w:t>
-      </w:r>
-      <w:r>
-        <w:rPr>
-          <w:rFonts w:ascii="Arial" w:eastAsia="Batang" w:hAnsi="Arial" w:cs="Arial"/>
-          <w:sz w:val="14"/>
-          <w:szCs w:val="14"/>
-        </w:rPr>
-        <w:t xml:space="preserve">se hizo constar </w:t>
-      </w:r>
-      <w:r>
-        <w:rPr>
-          <w:rFonts w:ascii="Arial" w:eastAsia="Batang" w:hAnsi="Arial" w:cs="Arial"/>
-          <w:sz w:val="14"/>
-          <w:szCs w:val="14"/>
-        </w:rPr>
-        <w:t>entre otros actos</w:t>
-      </w:r>
-      <w:r>
-        <w:rPr>
-          <w:rFonts w:ascii="Arial" w:eastAsia="Batang" w:hAnsi="Arial" w:cs="Arial"/>
-          <w:sz w:val="14"/>
-          <w:szCs w:val="14"/>
-        </w:rPr>
-        <w:t>,</w:t>
-      </w:r>
-      <w:r>
-        <w:rPr>
-          <w:rFonts w:ascii="Arial" w:eastAsia="Batang" w:hAnsi="Arial" w:cs="Arial"/>
-          <w:sz w:val="14"/>
-          <w:szCs w:val="14"/>
-        </w:rPr>
-        <w:t xml:space="preserve"> </w:t>
-      </w:r>
-      <w:r>
-        <w:rPr>
-          <w:rFonts w:ascii="Arial" w:eastAsia="Batang" w:hAnsi="Arial" w:cs="Arial"/>
-          <w:bCs/>
-          <w:sz w:val="14"/>
-          <w:szCs w:val="14"/>
-        </w:rPr>
-        <w:t xml:space="preserve">el </w:t>
-      </w:r>
-      <w:r>
-        <w:rPr>
-          <w:rFonts w:ascii="Arial" w:eastAsia="Batang" w:hAnsi="Arial" w:cs="Arial"/>
-          <w:bCs/>
-          <w:sz w:val="14"/>
-          <w:szCs w:val="14"/>
-        </w:rPr>
-        <w:t>otorgamiento de crédito y constitución de garantía hipotecaria</w:t>
-      </w:r>
-      <w:r>
-        <w:rPr>
-          <w:rFonts w:ascii="Arial" w:eastAsia="Batang" w:hAnsi="Arial" w:cs="Arial"/>
-          <w:bCs/>
-          <w:sz w:val="14"/>
-          <w:szCs w:val="14"/>
-        </w:rPr>
-        <w:t>,</w:t>
-      </w:r>
-      <w:r>
-        <w:rPr>
-          <w:rFonts w:ascii="Arial" w:eastAsia="Batang" w:hAnsi="Arial" w:cs="Arial"/>
-          <w:b/>
-          <w:sz w:val="14"/>
-          <w:szCs w:val="14"/>
-        </w:rPr>
-        <w:t xml:space="preserve"> </w:t>
-      </w:r>
-      <w:r>
-        <w:rPr>
-          <w:rFonts w:ascii="Arial" w:eastAsia="Batang" w:hAnsi="Arial" w:cs="Arial"/>
-          <w:sz w:val="14"/>
-          <w:szCs w:val="14"/>
-        </w:rPr>
-        <w:t>por medio del cual</w:t>
-      </w:r>
-      <w:r>
-        <w:rPr>
-          <w:rFonts w:ascii="Arial" w:eastAsia="Batang" w:hAnsi="Arial" w:cs="Arial"/>
-          <w:sz w:val="14"/>
-          <w:szCs w:val="14"/>
-        </w:rPr>
-        <w:t xml:space="preserve"> el</w:t>
-      </w:r>
-      <w:r>
-        <w:rPr>
-          <w:rFonts w:ascii="Arial" w:eastAsia="Batang" w:hAnsi="Arial" w:cs="Arial"/>
-          <w:sz w:val="14"/>
-          <w:szCs w:val="14"/>
-        </w:rPr>
-        <w:t xml:space="preserve"> </w:t>
-      </w:r>
-      <w:r>
-        <w:rPr>
-          <w:rFonts w:ascii="Arial" w:eastAsia="Batang" w:hAnsi="Arial" w:cs="Arial"/>
-          <w:b/>
-          <w:sz w:val="14"/>
-          <w:szCs w:val="14"/>
-        </w:rPr>
-        <w:t xml:space="preserve">INSTITUTO DEL FONDO NACIONAL </w:t>
-      </w:r>
-      <w:r>
-        <w:rPr>
-          <w:rFonts w:ascii="Arial" w:eastAsia="Batang" w:hAnsi="Arial" w:cs="Arial"/>
-          <w:b/>
-          <w:sz w:val="14"/>
-          <w:szCs w:val="14"/>
-        </w:rPr>
-        <w:t xml:space="preserve">DE LA VIVIENDA </w:t>
-      </w:r>
-      <w:r>
-        <w:rPr>
-          <w:rFonts w:ascii="Arial" w:eastAsia="Batang" w:hAnsi="Arial" w:cs="Arial"/>
-          <w:b/>
-          <w:sz w:val="14"/>
-          <w:szCs w:val="14"/>
-        </w:rPr>
-        <w:t>PARA LOS TRABAJADORES</w:t>
-      </w:r>
-      <w:r>
-        <w:rPr>
-          <w:rFonts w:ascii="Arial" w:eastAsia="Batang" w:hAnsi="Arial" w:cs="Arial"/>
-          <w:sz w:val="14"/>
-          <w:szCs w:val="14"/>
-        </w:rPr>
-        <w:t>,</w:t>
-      </w:r>
-      <w:r>
-        <w:rPr>
-          <w:rFonts w:ascii="Arial" w:eastAsia="Batang" w:hAnsi="Arial" w:cs="Arial"/>
-          <w:b/>
-          <w:sz w:val="14"/>
-          <w:szCs w:val="14"/>
-        </w:rPr>
-        <w:t xml:space="preserve"> </w:t>
-      </w:r>
-      <w:r>
-        <w:rPr>
-          <w:rFonts w:ascii="Arial" w:eastAsia="Batang" w:hAnsi="Arial" w:cs="Arial"/>
-          <w:sz w:val="14"/>
-          <w:szCs w:val="14"/>
-        </w:rPr>
-        <w:t>otorg</w:t>
-      </w:r>
-      <w:r>
-        <w:rPr>
-          <w:rFonts w:ascii="Arial" w:eastAsia="Batang" w:hAnsi="Arial" w:cs="Arial"/>
-          <w:sz w:val="14"/>
-          <w:szCs w:val="14"/>
-        </w:rPr>
-        <w:t>ó</w:t>
-      </w:r>
-      <w:r>
-        <w:rPr>
-          <w:rFonts w:ascii="Arial" w:eastAsia="Batang" w:hAnsi="Arial" w:cs="Arial"/>
-          <w:sz w:val="14"/>
-          <w:szCs w:val="14"/>
-        </w:rPr>
-        <w:t xml:space="preserve"> </w:t>
-      </w:r>
-      <w:r>
-        <w:rPr>
-          <w:rFonts w:ascii="Arial" w:eastAsia="Batang" w:hAnsi="Arial" w:cs="Arial"/>
-          <w:sz w:val="14"/>
-          <w:szCs w:val="14"/>
-        </w:rPr>
-        <w:t xml:space="preserve">a la </w:t>
-      </w:r>
-      <w:r>
-        <w:rPr>
-          <w:rFonts w:ascii="Arial" w:eastAsia="Batang" w:hAnsi="Arial" w:cs="Arial"/>
-          <w:sz w:val="14"/>
-          <w:szCs w:val="14"/>
-        </w:rPr>
-        <w:t>señor</w:t>
-      </w:r>
-      <w:r>
-        <w:rPr>
-          <w:rFonts w:ascii="Arial" w:eastAsia="Batang" w:hAnsi="Arial" w:cs="Arial"/>
-          <w:sz w:val="14"/>
-          <w:szCs w:val="14"/>
-        </w:rPr>
-        <w:t>a</w:t>
-      </w:r>
-      <w:r>
-        <w:rPr>
-          <w:rFonts w:ascii="Arial" w:hAnsi="Arial" w:cs="Arial"/>
-          <w:b/>
-          <w:bCs/>
-          <w:sz w:val="14"/>
-          <w:szCs w:val="14"/>
-          <w:lang w:val="es-ES"/>
-        </w:rPr>
-        <w:t xml:space="preserve"> </w:t>
-      </w:r>
-      <w:proofErr w:type="gramStart"/>
-      <w:r>
-        <w:rPr>
-          <w:rFonts w:ascii="Arial" w:hAnsi="Arial" w:cs="Arial"/>
-          <w:b/>
-          <w:sz w:val="14"/>
-          <w:szCs w:val="14"/>
-          <w:highlight w:val="yellow"/>
-          <w:lang w:val="es-MX"/>
-        </w:rPr>
-        <w:t xml:space="preserve">{{ </w:t>
-      </w:r>
-      <w:proofErr w:type="spellStart"/>
-      <w:r>
-        <w:rPr>
-          <w:rFonts w:ascii="Arial" w:hAnsi="Arial" w:cs="Arial"/>
-          <w:b/>
-          <w:sz w:val="14"/>
-          <w:szCs w:val="14"/>
-          <w:highlight w:val="yellow"/>
-          <w:lang w:val="es-MX"/>
-        </w:rPr>
-        <w:t>nombre</w:t>
-      </w:r>
-      <w:proofErr w:type="gramEnd"/>
-      <w:r>
-        <w:rPr>
-          <w:rFonts w:ascii="Arial" w:hAnsi="Arial" w:cs="Arial"/>
-          <w:b/>
-          <w:sz w:val="14"/>
-          <w:szCs w:val="14"/>
-          <w:highlight w:val="yellow"/>
-          <w:lang w:val="es-MX"/>
-        </w:rPr>
-        <w:t>_</w:t>
-      </w:r>
-      <w:proofErr w:type="gramStart"/>
-      <w:r>
-        <w:rPr>
-          <w:rFonts w:ascii="Arial" w:hAnsi="Arial" w:cs="Arial"/>
-          <w:b/>
-          <w:sz w:val="14"/>
-          <w:szCs w:val="14"/>
-          <w:highlight w:val="yellow"/>
-          <w:lang w:val="es-MX"/>
-        </w:rPr>
-        <w:t>acreditado</w:t>
-      </w:r>
-      <w:proofErr w:type="spellEnd"/>
-      <w:r>
-        <w:rPr>
-          <w:rFonts w:ascii="Arial" w:hAnsi="Arial" w:cs="Arial"/>
-          <w:b/>
-          <w:sz w:val="14"/>
-          <w:szCs w:val="14"/>
-          <w:highlight w:val="yellow"/>
-          <w:lang w:val="es-MX"/>
-        </w:rPr>
-        <w:t xml:space="preserve"> }</w:t>
-      </w:r>
-      <w:proofErr w:type="gramEnd"/>
-      <w:r>
-        <w:rPr>
-          <w:rFonts w:ascii="Arial" w:hAnsi="Arial" w:cs="Arial"/>
-          <w:b/>
-          <w:sz w:val="14"/>
-          <w:szCs w:val="14"/>
-          <w:highlight w:val="yellow"/>
-          <w:lang w:val="es-MX"/>
-        </w:rPr>
-        <w:t>}</w:t>
-      </w:r>
-      <w:r>
-        <w:rPr>
-          <w:rFonts w:ascii="Arial" w:hAnsi="Arial" w:cs="Arial"/>
-          <w:bCs/>
-          <w:sz w:val="14"/>
-          <w:szCs w:val="14"/>
-        </w:rPr>
-        <w:t xml:space="preserve">, </w:t>
-      </w:r>
-      <w:r>
-        <w:rPr>
-          <w:rFonts w:ascii="Arial" w:eastAsia="Batang" w:hAnsi="Arial" w:cs="Arial"/>
-          <w:bCs/>
-          <w:sz w:val="14"/>
-          <w:szCs w:val="14"/>
-        </w:rPr>
-        <w:t xml:space="preserve">un crédito </w:t>
-      </w:r>
-      <w:r>
-        <w:rPr>
-          <w:rFonts w:ascii="Arial" w:eastAsia="Batang" w:hAnsi="Arial" w:cs="Arial"/>
-          <w:sz w:val="14"/>
-          <w:szCs w:val="14"/>
-        </w:rPr>
-        <w:t>hasta</w:t>
-      </w:r>
-      <w:r>
-        <w:rPr>
-          <w:rFonts w:ascii="Arial" w:eastAsia="Batang" w:hAnsi="Arial" w:cs="Arial"/>
-          <w:sz w:val="14"/>
-          <w:szCs w:val="14"/>
-        </w:rPr>
-        <w:t xml:space="preserve"> </w:t>
-      </w:r>
-      <w:r>
-        <w:rPr>
-          <w:rFonts w:ascii="Arial" w:eastAsia="Batang" w:hAnsi="Arial" w:cs="Arial"/>
-          <w:sz w:val="14"/>
-          <w:szCs w:val="14"/>
-        </w:rPr>
-        <w:t>por</w:t>
       </w:r>
     </w:p>
     <w:p>
@@ -2112,7 +1943,6 @@
         </w:rPr>
         <w:t xml:space="preserve">equivalente a esa fecha a la cantidad de </w:t>
       </w:r>
-      <w:proofErr w:type="gramStart"/>
       <w:r>
         <w:rPr>
           <w:rFonts w:ascii="Arial" w:eastAsia="Batang" w:hAnsi="Arial" w:cs="Arial"/>
@@ -2120,7 +1950,6 @@
           <w:iCs/>
           <w:sz w:val="14"/>
           <w:szCs w:val="14"/>
-          <w:highlight w:val="yellow"/>
           <w:lang w:val="es-MX"/>
         </w:rPr>
         <w:t xml:space="preserve">{{ </w:t>
@@ -2133,12 +1962,11 @@
           <w:iCs/>
           <w:sz w:val="14"/>
           <w:szCs w:val="14"/>
-          <w:highlight w:val="yellow"/>
           <w:lang w:val="es-MX"/>
         </w:rPr>
-        <w:t>monto</w:t>
-      </w:r>
-      <w:proofErr w:type="gramEnd"/>
+        <w:t>monto_credito</w:t>
+      </w:r>
+      <w:proofErr w:type="spellEnd"/>
       <w:r>
         <w:rPr>
           <w:rFonts w:ascii="Arial" w:eastAsia="Batang" w:hAnsi="Arial" w:cs="Arial"/>
@@ -2146,49 +1974,9 @@
           <w:iCs/>
           <w:sz w:val="14"/>
           <w:szCs w:val="14"/>
-          <w:highlight w:val="yellow"/>
           <w:lang w:val="es-MX"/>
         </w:rPr>
-        <w:t>_</w:t>
-      </w:r>
-      <w:proofErr w:type="gramStart"/>
-      <w:r>
-        <w:rPr>
-          <w:rFonts w:ascii="Arial" w:eastAsia="Batang" w:hAnsi="Arial" w:cs="Arial"/>
-          <w:b/>
-          <w:iCs/>
-          <w:sz w:val="14"/>
-          <w:szCs w:val="14"/>
-          <w:highlight w:val="yellow"/>
-          <w:lang w:val="es-MX"/>
-        </w:rPr>
-        <w:t>credito</w:t>
-      </w:r>
-      <w:proofErr w:type="spellEnd"/>
-      <w:r>
-        <w:rPr>
-          <w:rFonts w:ascii="Arial" w:eastAsia="Batang" w:hAnsi="Arial" w:cs="Arial"/>
-          <w:b/>
-          <w:iCs/>
-          <w:sz w:val="14"/>
-          <w:szCs w:val="14"/>
-          <w:highlight w:val="yellow"/>
-          <w:lang w:val="es-MX"/>
-        </w:rPr>
-        <w:t xml:space="preserve"> }</w:t>
-      </w:r>
-      <w:proofErr w:type="gramEnd"/>
-      <w:r>
-        <w:rPr>
-          <w:rFonts w:ascii="Arial" w:eastAsia="Batang" w:hAnsi="Arial" w:cs="Arial"/>
-          <w:b/>
-          <w:iCs/>
-          <w:sz w:val="14"/>
-          <w:szCs w:val="14"/>
-          <w:highlight w:val="yellow"/>
-          <w:lang w:val="es-MX"/>
-        </w:rPr>
-        <w:t>}</w:t>
+        <w:t xml:space="preserve"> }}</w:t>
       </w:r>
       <w:r>
         <w:rPr>
@@ -2465,7 +2253,6 @@
         </w:rPr>
         <w:t xml:space="preserve"> </w:t>
       </w:r>
-      <w:proofErr w:type="gramStart"/>
       <w:r>
         <w:rPr>
           <w:rFonts w:ascii="Arial" w:eastAsia="Batang" w:hAnsi="Arial" w:cs="Arial"/>
@@ -2485,88 +2272,37 @@
       <w:r>
         <w:rPr>
           <w:rFonts w:ascii="Arial" w:eastAsia="Batang" w:hAnsi="Arial" w:cs="Arial"/>
+          <w:b/>
+          <w:bCs/>
           <w:sz w:val="14"/>
           <w:szCs w:val="14"/>
           <w:lang w:val="es-MX"/>
         </w:rPr>
-        <w:t xml:space="preserve"> </w:t>
-      </w:r>
-      <w:r>
-        <w:rPr>
-          <w:rFonts w:ascii="Arial" w:eastAsia="Batang" w:hAnsi="Arial" w:cs="Arial"/>
-          <w:b/>
-          <w:bCs/>
-          <w:sz w:val="14"/>
-          <w:szCs w:val="14"/>
-          <w:highlight w:val="yellow"/>
+        <w:t xml:space="preserve">{{ </w:t>
+      </w:r>
+      <w:proofErr w:type="spellStart"/>
+      <w:r>
+        <w:rPr>
+          <w:rFonts w:ascii="Arial" w:eastAsia="Batang" w:hAnsi="Arial" w:cs="Arial"/>
+          <w:b/>
+          <w:bCs/>
+          <w:sz w:val="14"/>
+          <w:szCs w:val="14"/>
           <w:lang w:val="es-MX"/>
         </w:rPr>
-        <w:t xml:space="preserve">{{ </w:t>
-      </w:r>
-      <w:proofErr w:type="spellStart"/>
-      <w:r>
-        <w:rPr>
-          <w:rFonts w:ascii="Arial" w:eastAsia="Batang" w:hAnsi="Arial" w:cs="Arial"/>
-          <w:b/>
-          <w:bCs/>
-          <w:sz w:val="14"/>
-          <w:szCs w:val="14"/>
-          <w:highlight w:val="yellow"/>
+        <w:t>datos_inmueble</w:t>
+      </w:r>
+      <w:proofErr w:type="spellEnd"/>
+      <w:r>
+        <w:rPr>
+          <w:rFonts w:ascii="Arial" w:eastAsia="Batang" w:hAnsi="Arial" w:cs="Arial"/>
+          <w:b/>
+          <w:bCs/>
+          <w:sz w:val="14"/>
+          <w:szCs w:val="14"/>
           <w:lang w:val="es-MX"/>
         </w:rPr>
-        <w:t>datos</w:t>
-      </w:r>
-      <w:proofErr w:type="gramEnd"/>
-      <w:r>
-        <w:rPr>
-          <w:rFonts w:ascii="Arial" w:eastAsia="Batang" w:hAnsi="Arial" w:cs="Arial"/>
-          <w:b/>
-          <w:bCs/>
-          <w:sz w:val="14"/>
-          <w:szCs w:val="14"/>
-          <w:highlight w:val="yellow"/>
-          <w:lang w:val="es-MX"/>
-        </w:rPr>
-        <w:t>_</w:t>
-      </w:r>
-      <w:proofErr w:type="gramStart"/>
-      <w:r>
-        <w:rPr>
-          <w:rFonts w:ascii="Arial" w:eastAsia="Batang" w:hAnsi="Arial" w:cs="Arial"/>
-          <w:b/>
-          <w:bCs/>
-          <w:sz w:val="14"/>
-          <w:szCs w:val="14"/>
-          <w:highlight w:val="yellow"/>
-          <w:lang w:val="es-MX"/>
-        </w:rPr>
-        <w:t>inmueble</w:t>
-      </w:r>
-      <w:proofErr w:type="spellEnd"/>
-      <w:r>
-        <w:rPr>
-          <w:rFonts w:ascii="Arial" w:eastAsia="Batang" w:hAnsi="Arial" w:cs="Arial"/>
-          <w:b/>
-          <w:bCs/>
-          <w:sz w:val="14"/>
-          <w:szCs w:val="14"/>
-          <w:highlight w:val="yellow"/>
-          <w:lang w:val="es-MX"/>
-        </w:rPr>
-        <w:t xml:space="preserve"> }</w:t>
-      </w:r>
-      <w:proofErr w:type="gramEnd"/>
-      <w:r>
-        <w:rPr>
-          <w:rFonts w:ascii="Arial" w:eastAsia="Batang" w:hAnsi="Arial" w:cs="Arial"/>
-          <w:b/>
-          <w:bCs/>
-          <w:sz w:val="14"/>
-          <w:szCs w:val="14"/>
-          <w:highlight w:val="yellow"/>
-          <w:lang w:val="es-MX"/>
-        </w:rPr>
-        <w:t>}</w:t>
+        <w:t xml:space="preserve"> }}</w:t>
       </w:r>
       <w:r>
         <w:rPr>
@@ -2731,7 +2467,6 @@
         </w:rPr>
         <w:t xml:space="preserve">DATOS DE </w:t>
       </w:r>
-      <w:proofErr w:type="gramStart"/>
       <w:r>
         <w:rPr>
           <w:rFonts w:ascii="Arial" w:hAnsi="Arial" w:cs="Arial"/>
@@ -2759,9 +2494,8 @@
           <w:szCs w:val="14"/>
           <w:lang w:val="es-ES"/>
         </w:rPr>
-        <w:t>.-</w:t>
-      </w:r>
-      <w:proofErr w:type="gramEnd"/>
+        <w:t>. -</w:t>
+      </w:r>
       <w:r>
         <w:rPr>
           <w:rFonts w:ascii="Arial" w:hAnsi="Arial" w:cs="Arial"/>
@@ -2823,9 +2557,9 @@
           <w:szCs w:val="14"/>
           <w:lang w:val="es-ES"/>
         </w:rPr>
-        <w:t xml:space="preserve">e </w:t>
-      </w:r>
-      <w:proofErr w:type="gramStart"/>
+        <w:t xml:space="preserve">e {{ </w:t>
+      </w:r>
+      <w:proofErr w:type="spellStart"/>
       <w:r>
         <w:rPr>
           <w:rFonts w:ascii="Arial" w:hAnsi="Arial" w:cs="Arial"/>
@@ -2833,9 +2567,9 @@
           <w:szCs w:val="14"/>
           <w:lang w:val="es-ES"/>
         </w:rPr>
-        <w:t xml:space="preserve">{{ </w:t>
-      </w:r>
-      <w:proofErr w:type="spellStart"/>
+        <w:t>oficina_registral</w:t>
+      </w:r>
+      <w:proofErr w:type="spellEnd"/>
       <w:r>
         <w:rPr>
           <w:rFonts w:ascii="Arial" w:hAnsi="Arial" w:cs="Arial"/>
@@ -2843,9 +2577,8 @@
           <w:szCs w:val="14"/>
           <w:lang w:val="es-ES"/>
         </w:rPr>
-        <w:t>oficina</w:t>
-      </w:r>
-      <w:proofErr w:type="gramEnd"/>
+        <w:t xml:space="preserve"> }}</w:t>
+      </w:r>
       <w:r>
         <w:rPr>
           <w:rFonts w:ascii="Arial" w:hAnsi="Arial" w:cs="Arial"/>
@@ -2853,66 +2586,7 @@
           <w:szCs w:val="14"/>
           <w:lang w:val="es-ES"/>
         </w:rPr>
-        <w:t>_</w:t>
-      </w:r>
-      <w:proofErr w:type="gramStart"/>
-      <w:r>
-        <w:rPr>
-          <w:rFonts w:ascii="Arial" w:hAnsi="Arial" w:cs="Arial"/>
-          <w:sz w:val="14"/>
-          <w:szCs w:val="14"/>
-          <w:lang w:val="es-ES"/>
-        </w:rPr>
-        <w:t>registral</w:t>
-      </w:r>
-      <w:proofErr w:type="spellEnd"/>
-      <w:r>
-        <w:rPr>
-          <w:rFonts w:ascii="Arial" w:hAnsi="Arial" w:cs="Arial"/>
-          <w:sz w:val="14"/>
-          <w:szCs w:val="14"/>
-          <w:lang w:val="es-ES"/>
-        </w:rPr>
-        <w:t xml:space="preserve"> }</w:t>
-      </w:r>
-      <w:proofErr w:type="gramEnd"/>
-      <w:r>
-        <w:rPr>
-          <w:rFonts w:ascii="Arial" w:hAnsi="Arial" w:cs="Arial"/>
-          <w:sz w:val="14"/>
-          <w:szCs w:val="14"/>
-          <w:lang w:val="es-ES"/>
-        </w:rPr>
-        <w:t>}</w:t>
-      </w:r>
-      <w:r>
-        <w:rPr>
-          <w:rFonts w:ascii="Arial" w:hAnsi="Arial" w:cs="Arial"/>
-          <w:sz w:val="14"/>
-          <w:szCs w:val="14"/>
-          <w:lang w:val="es-ES"/>
-        </w:rPr>
-        <w:t xml:space="preserve">, en el libro primero, sección primera, volumen número   y bajo la partida número    </w:t>
-      </w:r>
-      <w:proofErr w:type="gramStart"/>
-      <w:r>
-        <w:rPr>
-          <w:rFonts w:ascii="Arial" w:hAnsi="Arial" w:cs="Arial"/>
-          <w:sz w:val="14"/>
-          <w:szCs w:val="14"/>
-          <w:lang w:val="es-ES"/>
-        </w:rPr>
-        <w:t xml:space="preserve">  ,</w:t>
-      </w:r>
-      <w:proofErr w:type="gramEnd"/>
-      <w:r>
-        <w:rPr>
-          <w:rFonts w:ascii="Arial" w:hAnsi="Arial" w:cs="Arial"/>
-          <w:sz w:val="14"/>
-          <w:szCs w:val="14"/>
-          <w:lang w:val="es-ES"/>
-        </w:rPr>
-        <w:t xml:space="preserve"> en el libro segundo, sección primera, volumen número  </w:t>
+        <w:t xml:space="preserve">, en el libro primero, sección primera, volumen número   y bajo la partida número      , en el libro segundo, sección primera, volumen número  </w:t>
       </w:r>
     </w:p>
     <w:p>
@@ -3040,88 +2714,33 @@
           <w:bCs/>
           <w:sz w:val="14"/>
           <w:szCs w:val="14"/>
-          <w:highlight w:val="yellow"/>
           <w:lang w:val="es-MX"/>
         </w:rPr>
-        <w:t>“</w:t>
-      </w:r>
-      <w:proofErr w:type="gramStart"/>
-      <w:r>
-        <w:rPr>
-          <w:rFonts w:ascii="Arial" w:hAnsi="Arial" w:cs="Arial"/>
-          <w:b/>
-          <w:bCs/>
-          <w:sz w:val="14"/>
-          <w:szCs w:val="14"/>
-          <w:highlight w:val="yellow"/>
+        <w:t xml:space="preserve">“{{ </w:t>
+      </w:r>
+      <w:proofErr w:type="spellStart"/>
+      <w:r>
+        <w:rPr>
+          <w:rFonts w:ascii="Arial" w:hAnsi="Arial" w:cs="Arial"/>
+          <w:b/>
+          <w:bCs/>
+          <w:sz w:val="14"/>
+          <w:szCs w:val="14"/>
           <w:lang w:val="es-MX"/>
         </w:rPr>
-        <w:t xml:space="preserve">{{ </w:t>
-      </w:r>
-      <w:proofErr w:type="spellStart"/>
-      <w:r>
-        <w:rPr>
-          <w:rFonts w:ascii="Arial" w:hAnsi="Arial" w:cs="Arial"/>
-          <w:b/>
-          <w:bCs/>
-          <w:sz w:val="14"/>
-          <w:szCs w:val="14"/>
-          <w:highlight w:val="yellow"/>
+        <w:t>folio_real</w:t>
+      </w:r>
+      <w:proofErr w:type="spellEnd"/>
+      <w:r>
+        <w:rPr>
+          <w:rFonts w:ascii="Arial" w:hAnsi="Arial" w:cs="Arial"/>
+          <w:b/>
+          <w:bCs/>
+          <w:sz w:val="14"/>
+          <w:szCs w:val="14"/>
           <w:lang w:val="es-MX"/>
         </w:rPr>
-        <w:t>folio</w:t>
-      </w:r>
-      <w:proofErr w:type="gramEnd"/>
-      <w:r>
-        <w:rPr>
-          <w:rFonts w:ascii="Arial" w:hAnsi="Arial" w:cs="Arial"/>
-          <w:b/>
-          <w:bCs/>
-          <w:sz w:val="14"/>
-          <w:szCs w:val="14"/>
-          <w:highlight w:val="yellow"/>
-          <w:lang w:val="es-MX"/>
-        </w:rPr>
-        <w:t>_</w:t>
-      </w:r>
-      <w:proofErr w:type="gramStart"/>
-      <w:r>
-        <w:rPr>
-          <w:rFonts w:ascii="Arial" w:hAnsi="Arial" w:cs="Arial"/>
-          <w:b/>
-          <w:bCs/>
-          <w:sz w:val="14"/>
-          <w:szCs w:val="14"/>
-          <w:highlight w:val="yellow"/>
-          <w:lang w:val="es-MX"/>
-        </w:rPr>
-        <w:t>real</w:t>
-      </w:r>
-      <w:proofErr w:type="spellEnd"/>
-      <w:r>
-        <w:rPr>
-          <w:rFonts w:ascii="Arial" w:hAnsi="Arial" w:cs="Arial"/>
-          <w:b/>
-          <w:bCs/>
-          <w:sz w:val="14"/>
-          <w:szCs w:val="14"/>
-          <w:highlight w:val="yellow"/>
-          <w:lang w:val="es-MX"/>
-        </w:rPr>
-        <w:t xml:space="preserve"> }</w:t>
-      </w:r>
-      <w:proofErr w:type="gramEnd"/>
-      <w:r>
-        <w:rPr>
-          <w:rFonts w:ascii="Arial" w:hAnsi="Arial" w:cs="Arial"/>
-          <w:b/>
-          <w:bCs/>
-          <w:sz w:val="14"/>
-          <w:szCs w:val="14"/>
-          <w:highlight w:val="yellow"/>
-          <w:lang w:val="es-MX"/>
-        </w:rPr>
-        <w:t>}”</w:t>
+        <w:t xml:space="preserve"> }}”</w:t>
       </w:r>
       <w:r>
         <w:rPr>
@@ -3187,7 +2806,6 @@
           <w:rFonts w:ascii="Arial" w:hAnsi="Arial" w:cs="Arial"/>
           <w:sz w:val="14"/>
           <w:szCs w:val="14"/>
-          <w:highlight w:val="yellow"/>
         </w:rPr>
         <w:t>{{ FECHA_DE_EXPEDICION }}</w:t>
       </w:r>
@@ -3245,9 +2863,10 @@
       <w:r>
         <w:rPr>
           <w:rFonts w:ascii="Arial" w:hAnsi="Arial" w:cs="Arial"/>
-          <w:sz w:val="14"/>
-          <w:szCs w:val="14"/>
-          <w:highlight w:val="yellow"/>
+          <w:b/>
+          <w:bCs/>
+          <w:sz w:val="14"/>
+          <w:szCs w:val="14"/>
         </w:rPr>
         <w:t xml:space="preserve">{{ </w:t>
       </w:r>
@@ -3255,9 +2874,10 @@
       <w:r>
         <w:rPr>
           <w:rFonts w:ascii="Arial" w:hAnsi="Arial" w:cs="Arial"/>
-          <w:sz w:val="14"/>
-          <w:szCs w:val="14"/>
-          <w:highlight w:val="yellow"/>
+          <w:b/>
+          <w:bCs/>
+          <w:sz w:val="14"/>
+          <w:szCs w:val="14"/>
         </w:rPr>
         <w:t>numero_carta</w:t>
       </w:r>
@@ -3265,9 +2885,10 @@
       <w:r>
         <w:rPr>
           <w:rFonts w:ascii="Arial" w:hAnsi="Arial" w:cs="Arial"/>
-          <w:sz w:val="14"/>
-          <w:szCs w:val="14"/>
-          <w:highlight w:val="yellow"/>
+          <w:b/>
+          <w:bCs/>
+          <w:sz w:val="14"/>
+          <w:szCs w:val="14"/>
         </w:rPr>
         <w:t xml:space="preserve"> }}</w:t>
       </w:r>
@@ -3430,9 +3051,10 @@
       <w:r>
         <w:rPr>
           <w:rFonts w:ascii="Arial" w:hAnsi="Arial" w:cs="Arial"/>
-          <w:sz w:val="14"/>
-          <w:szCs w:val="14"/>
-          <w:highlight w:val="yellow"/>
+          <w:b/>
+          <w:bCs/>
+          <w:sz w:val="14"/>
+          <w:szCs w:val="14"/>
         </w:rPr>
         <w:t xml:space="preserve">{{ </w:t>
       </w:r>
@@ -3440,9 +3062,10 @@
       <w:r>
         <w:rPr>
           <w:rFonts w:ascii="Arial" w:hAnsi="Arial" w:cs="Arial"/>
-          <w:sz w:val="14"/>
-          <w:szCs w:val="14"/>
-          <w:highlight w:val="yellow"/>
+          <w:b/>
+          <w:bCs/>
+          <w:sz w:val="14"/>
+          <w:szCs w:val="14"/>
         </w:rPr>
         <w:t>fecha_liquidacion</w:t>
       </w:r>
@@ -3450,9 +3073,10 @@
       <w:r>
         <w:rPr>
           <w:rFonts w:ascii="Arial" w:hAnsi="Arial" w:cs="Arial"/>
-          <w:sz w:val="14"/>
-          <w:szCs w:val="14"/>
-          <w:highlight w:val="yellow"/>
+          <w:b/>
+          <w:bCs/>
+          <w:sz w:val="14"/>
+          <w:szCs w:val="14"/>
         </w:rPr>
         <w:t xml:space="preserve"> }}</w:t>
       </w:r>
@@ -4057,22 +3681,30 @@
       <w:r>
         <w:rPr>
           <w:rFonts w:ascii="Arial" w:hAnsi="Arial" w:cs="Arial"/>
-          <w:bCs/>
-          <w:sz w:val="14"/>
-          <w:szCs w:val="14"/>
-          <w:highlight w:val="yellow"/>
+          <w:b/>
+          <w:sz w:val="14"/>
+          <w:szCs w:val="14"/>
           <w:lang w:val="es-MX"/>
         </w:rPr>
-        <w:t xml:space="preserve">{{ </w:t>
+        <w:t>{{</w:t>
+      </w:r>
+      <w:r>
+        <w:rPr>
+          <w:rFonts w:ascii="Arial" w:hAnsi="Arial" w:cs="Arial"/>
+          <w:b/>
+          <w:sz w:val="14"/>
+          <w:szCs w:val="14"/>
+          <w:lang w:val="es-MX"/>
+        </w:rPr>
+        <w:t xml:space="preserve"> </w:t>
       </w:r>
       <w:proofErr w:type="spellStart"/>
       <w:r>
         <w:rPr>
           <w:rFonts w:ascii="Arial" w:hAnsi="Arial" w:cs="Arial"/>
-          <w:bCs/>
-          <w:sz w:val="14"/>
-          <w:szCs w:val="14"/>
-          <w:highlight w:val="yellow"/>
+          <w:b/>
+          <w:sz w:val="14"/>
+          <w:szCs w:val="14"/>
           <w:lang w:val="es-MX"/>
         </w:rPr>
         <w:t>numero_credito</w:t>
@@ -4081,24 +3713,12 @@
       <w:r>
         <w:rPr>
           <w:rFonts w:ascii="Arial" w:hAnsi="Arial" w:cs="Arial"/>
-          <w:bCs/>
-          <w:sz w:val="14"/>
-          <w:szCs w:val="14"/>
-          <w:highlight w:val="yellow"/>
+          <w:b/>
+          <w:sz w:val="14"/>
+          <w:szCs w:val="14"/>
           <w:lang w:val="es-MX"/>
         </w:rPr>
-        <w:t xml:space="preserve"> </w:t>
-      </w:r>
-      <w:r>
-        <w:rPr>
-          <w:rFonts w:ascii="Arial" w:hAnsi="Arial" w:cs="Arial"/>
-          <w:bCs/>
-          <w:sz w:val="14"/>
-          <w:szCs w:val="14"/>
-          <w:highlight w:val="yellow"/>
-          <w:lang w:val="es-MX"/>
-        </w:rPr>
-        <w:t>}}</w:t>
+        <w:t xml:space="preserve"> }}</w:t>
       </w:r>
       <w:r>
         <w:rPr>
@@ -4314,7 +3934,6 @@
         </w:rPr>
         <w:t xml:space="preserve">-------- </w:t>
       </w:r>
-      <w:proofErr w:type="gramStart"/>
       <w:r>
         <w:rPr>
           <w:rFonts w:ascii="Arial" w:hAnsi="Arial" w:cs="Arial"/>
@@ -4332,9 +3951,8 @@
           <w:sz w:val="14"/>
           <w:szCs w:val="14"/>
         </w:rPr>
-        <w:t>.-</w:t>
-      </w:r>
-      <w:proofErr w:type="gramEnd"/>
+        <w:t>. -</w:t>
+      </w:r>
       <w:r>
         <w:rPr>
           <w:rFonts w:ascii="Arial" w:hAnsi="Arial" w:cs="Arial"/>
@@ -4344,17 +3962,15 @@
         </w:rPr>
         <w:t xml:space="preserve"> En </w:t>
       </w:r>
-      <w:proofErr w:type="gramStart"/>
-      <w:r>
-        <w:rPr>
-          <w:rFonts w:ascii="Arial" w:hAnsi="Arial" w:cs="Arial"/>
-          <w:bCs/>
-          <w:sz w:val="14"/>
-          <w:szCs w:val="14"/>
-        </w:rPr>
-        <w:t>consecuencia</w:t>
-      </w:r>
-      <w:proofErr w:type="gramEnd"/>
+      <w:r>
+        <w:rPr>
+          <w:rFonts w:ascii="Arial" w:hAnsi="Arial" w:cs="Arial"/>
+          <w:bCs/>
+          <w:sz w:val="14"/>
+          <w:szCs w:val="14"/>
+        </w:rPr>
+        <w:t>consecuencia,</w:t>
+      </w:r>
       <w:r>
         <w:rPr>
           <w:rFonts w:ascii="Arial" w:hAnsi="Arial" w:cs="Arial"/>
@@ -4437,17 +4053,15 @@
         </w:rPr>
         <w:t xml:space="preserve">, da su consentimiento para </w:t>
       </w:r>
-      <w:proofErr w:type="gramStart"/>
-      <w:r>
-        <w:rPr>
-          <w:rFonts w:ascii="Arial" w:hAnsi="Arial" w:cs="Arial"/>
-          <w:bCs/>
-          <w:sz w:val="14"/>
-          <w:szCs w:val="14"/>
-        </w:rPr>
-        <w:t>que</w:t>
-      </w:r>
-      <w:proofErr w:type="gramEnd"/>
+      <w:r>
+        <w:rPr>
+          <w:rFonts w:ascii="Arial" w:hAnsi="Arial" w:cs="Arial"/>
+          <w:bCs/>
+          <w:sz w:val="14"/>
+          <w:szCs w:val="14"/>
+        </w:rPr>
+        <w:t>que,</w:t>
+      </w:r>
       <w:r>
         <w:rPr>
           <w:rFonts w:ascii="Arial" w:hAnsi="Arial" w:cs="Arial"/>
@@ -4556,18 +4170,16 @@
         </w:rPr>
         <w:t xml:space="preserve">-------- </w:t>
       </w:r>
-      <w:proofErr w:type="gramStart"/>
-      <w:r>
-        <w:rPr>
-          <w:rFonts w:ascii="Arial" w:hAnsi="Arial" w:cs="Arial"/>
-          <w:b/>
-          <w:bCs/>
-          <w:sz w:val="14"/>
-          <w:szCs w:val="14"/>
-        </w:rPr>
-        <w:t>TERCERA.-</w:t>
-      </w:r>
-      <w:proofErr w:type="gramEnd"/>
+      <w:r>
+        <w:rPr>
+          <w:rFonts w:ascii="Arial" w:hAnsi="Arial" w:cs="Arial"/>
+          <w:b/>
+          <w:bCs/>
+          <w:sz w:val="14"/>
+          <w:szCs w:val="14"/>
+        </w:rPr>
+        <w:t>TERCERA. -</w:t>
+      </w:r>
       <w:r>
         <w:rPr>
           <w:rFonts w:ascii="Arial" w:hAnsi="Arial" w:cs="Arial"/>
@@ -4816,18 +4428,16 @@
         </w:rPr>
         <w:t xml:space="preserve">-------- </w:t>
       </w:r>
-      <w:proofErr w:type="gramStart"/>
-      <w:r>
-        <w:rPr>
-          <w:rFonts w:ascii="Arial" w:hAnsi="Arial" w:cs="Arial"/>
-          <w:b/>
-          <w:bCs/>
-          <w:sz w:val="14"/>
-          <w:szCs w:val="14"/>
-        </w:rPr>
-        <w:t>CUARTA.-</w:t>
-      </w:r>
-      <w:proofErr w:type="gramEnd"/>
+      <w:r>
+        <w:rPr>
+          <w:rFonts w:ascii="Arial" w:hAnsi="Arial" w:cs="Arial"/>
+          <w:b/>
+          <w:bCs/>
+          <w:sz w:val="14"/>
+          <w:szCs w:val="14"/>
+        </w:rPr>
+        <w:t>CUARTA. -</w:t>
+      </w:r>
       <w:r>
         <w:rPr>
           <w:rFonts w:ascii="Arial" w:hAnsi="Arial" w:cs="Arial"/>
@@ -5698,7 +5308,6 @@
         </w:rPr>
         <w:t xml:space="preserve">-------- </w:t>
       </w:r>
-      <w:proofErr w:type="gramStart"/>
       <w:r>
         <w:rPr>
           <w:rFonts w:ascii="Arial" w:eastAsia="MS Mincho" w:hAnsi="Arial" w:cs="Arial"/>
@@ -5706,17 +5315,7 @@
           <w:szCs w:val="14"/>
           <w:lang w:val="es-MX"/>
         </w:rPr>
-        <w:t>VI.-</w:t>
-      </w:r>
-      <w:proofErr w:type="gramEnd"/>
-      <w:r>
-        <w:rPr>
-          <w:rFonts w:ascii="Arial" w:eastAsia="MS Mincho" w:hAnsi="Arial" w:cs="Arial"/>
-          <w:sz w:val="14"/>
-          <w:szCs w:val="14"/>
-          <w:lang w:val="es-MX"/>
-        </w:rPr>
-        <w:t xml:space="preserve"> Que leí este instrumento a la compareciente, a quien le expliqué su valor, fuerza y las consecuencias legales de su contenido, manifestando su conformidad con el mismo, por lo que lo otorga, ratifica y </w:t>
+        <w:t xml:space="preserve">VI.- Que leí este instrumento a la compareciente, a quien le expliqué su valor, fuerza y las consecuencias legales de su contenido, manifestando su conformidad con el mismo, por lo que lo otorga, ratifica y </w:t>
       </w:r>
       <w:r>
         <w:rPr>
@@ -6478,7 +6077,6 @@
         </w:rPr>
         <w:t xml:space="preserve">BENITA HERNÁNDEZ </w:t>
       </w:r>
-      <w:proofErr w:type="gramStart"/>
       <w:r>
         <w:rPr>
           <w:rFonts w:ascii="Arial" w:hAnsi="Arial" w:cs="Arial"/>
@@ -6493,9 +6091,8 @@
           <w:sz w:val="14"/>
           <w:szCs w:val="14"/>
         </w:rPr>
-        <w:t>.-</w:t>
-      </w:r>
-      <w:proofErr w:type="gramEnd"/>
+        <w:t>. -</w:t>
+      </w:r>
       <w:r>
         <w:rPr>
           <w:rFonts w:ascii="Arial" w:hAnsi="Arial" w:cs="Arial"/>
@@ -6504,16 +6101,14 @@
         </w:rPr>
         <w:t xml:space="preserve"> </w:t>
       </w:r>
-      <w:proofErr w:type="gramStart"/>
-      <w:r>
-        <w:rPr>
-          <w:rFonts w:ascii="Arial" w:hAnsi="Arial" w:cs="Arial"/>
-          <w:sz w:val="14"/>
-          <w:szCs w:val="14"/>
-        </w:rPr>
-        <w:t>FIRMA.-</w:t>
-      </w:r>
-      <w:proofErr w:type="gramEnd"/>
+      <w:r>
+        <w:rPr>
+          <w:rFonts w:ascii="Arial" w:hAnsi="Arial" w:cs="Arial"/>
+          <w:sz w:val="14"/>
+          <w:szCs w:val="14"/>
+        </w:rPr>
+        <w:t>FIRMA. -</w:t>
+      </w:r>
       <w:r>
         <w:rPr>
           <w:rFonts w:ascii="Arial" w:hAnsi="Arial" w:cs="Arial"/>
@@ -6539,7 +6134,6 @@
         </w:rPr>
         <w:t xml:space="preserve">JUAN CARLOS ORTEGA </w:t>
       </w:r>
-      <w:proofErr w:type="gramStart"/>
       <w:r>
         <w:rPr>
           <w:rFonts w:ascii="Arial" w:hAnsi="Arial" w:cs="Arial"/>
@@ -6547,9 +6141,8 @@
           <w:szCs w:val="14"/>
           <w:lang w:val="es-ES" w:eastAsia="es-MX"/>
         </w:rPr>
-        <w:t>REYES.-</w:t>
-      </w:r>
-      <w:proofErr w:type="gramEnd"/>
+        <w:t>REYES. -</w:t>
+      </w:r>
       <w:r>
         <w:rPr>
           <w:rFonts w:ascii="Arial" w:hAnsi="Arial" w:cs="Arial"/>
@@ -6559,7 +6152,6 @@
         </w:rPr>
         <w:t xml:space="preserve"> </w:t>
       </w:r>
-      <w:proofErr w:type="gramStart"/>
       <w:r>
         <w:rPr>
           <w:rFonts w:ascii="Arial" w:hAnsi="Arial" w:cs="Arial"/>
@@ -6567,9 +6159,8 @@
           <w:szCs w:val="14"/>
           <w:lang w:val="es-ES" w:eastAsia="es-MX"/>
         </w:rPr>
-        <w:t>FIRMA.-</w:t>
-      </w:r>
-      <w:proofErr w:type="gramEnd"/>
+        <w:t>FIRMA. -</w:t>
+      </w:r>
       <w:r>
         <w:rPr>
           <w:rFonts w:ascii="Arial" w:hAnsi="Arial" w:cs="Arial"/>
@@ -6702,14 +6293,12 @@
         </w:rPr>
         <w:t xml:space="preserve"> </w:t>
       </w:r>
-      <w:proofErr w:type="gramStart"/>
-      <w:r>
-        <w:rPr>
-          <w:rFonts w:ascii="Arial" w:hAnsi="Arial" w:cs="Arial"/>
-          <w:b/>
-          <w:sz w:val="14"/>
-          <w:szCs w:val="14"/>
-          <w:highlight w:val="yellow"/>
+      <w:r>
+        <w:rPr>
+          <w:rFonts w:ascii="Arial" w:hAnsi="Arial" w:cs="Arial"/>
+          <w:b/>
+          <w:sz w:val="14"/>
+          <w:szCs w:val="14"/>
         </w:rPr>
         <w:t>{{</w:t>
       </w:r>
@@ -6719,7 +6308,6 @@
           <w:b/>
           <w:sz w:val="14"/>
           <w:szCs w:val="14"/>
-          <w:highlight w:val="yellow"/>
           <w:u w:val="single"/>
         </w:rPr>
         <w:t xml:space="preserve"> </w:t>
@@ -6731,34 +6319,9 @@
           <w:b/>
           <w:sz w:val="14"/>
           <w:szCs w:val="14"/>
-          <w:highlight w:val="yellow"/>
           <w:u w:val="single"/>
         </w:rPr>
-        <w:t>nombre</w:t>
-      </w:r>
-      <w:proofErr w:type="gramEnd"/>
-      <w:r>
-        <w:rPr>
-          <w:rFonts w:ascii="Arial" w:hAnsi="Arial" w:cs="Arial"/>
-          <w:b/>
-          <w:sz w:val="14"/>
-          <w:szCs w:val="14"/>
-          <w:highlight w:val="yellow"/>
-          <w:u w:val="single"/>
-        </w:rPr>
-        <w:t>_</w:t>
-      </w:r>
-      <w:proofErr w:type="gramStart"/>
-      <w:r>
-        <w:rPr>
-          <w:rFonts w:ascii="Arial" w:hAnsi="Arial" w:cs="Arial"/>
-          <w:b/>
-          <w:sz w:val="14"/>
-          <w:szCs w:val="14"/>
-          <w:highlight w:val="yellow"/>
-          <w:u w:val="single"/>
-        </w:rPr>
-        <w:t>acreditado</w:t>
+        <w:t>nombre_acreditado</w:t>
       </w:r>
       <w:proofErr w:type="spellEnd"/>
       <w:r>
@@ -6767,20 +6330,8 @@
           <w:b/>
           <w:sz w:val="14"/>
           <w:szCs w:val="14"/>
-          <w:highlight w:val="yellow"/>
-        </w:rPr>
-        <w:t xml:space="preserve"> }</w:t>
-      </w:r>
-      <w:proofErr w:type="gramEnd"/>
-      <w:r>
-        <w:rPr>
-          <w:rFonts w:ascii="Arial" w:hAnsi="Arial" w:cs="Arial"/>
-          <w:b/>
-          <w:sz w:val="14"/>
-          <w:szCs w:val="14"/>
-          <w:highlight w:val="yellow"/>
-        </w:rPr>
-        <w:t>}</w:t>
+        </w:rPr>
+        <w:t xml:space="preserve"> }}</w:t>
       </w:r>
       <w:r>
         <w:rPr>
@@ -6837,7 +6388,6 @@
         </w:rPr>
         <w:t xml:space="preserve">DEL AÑO DOS MIL </w:t>
       </w:r>
-      <w:proofErr w:type="gramStart"/>
       <w:r>
         <w:rPr>
           <w:rFonts w:ascii="Arial" w:hAnsi="Arial" w:cs="Arial"/>
@@ -6863,9 +6413,8 @@
           <w:szCs w:val="14"/>
           <w:lang w:val="es-ES"/>
         </w:rPr>
-        <w:t>.-</w:t>
-      </w:r>
-      <w:proofErr w:type="gramEnd"/>
+        <w:t>. -</w:t>
+      </w:r>
       <w:r>
         <w:rPr>
           <w:rFonts w:ascii="Arial" w:hAnsi="Arial" w:cs="Arial"/>
@@ -8819,8 +8368,52 @@
     <w:lsdException w:name="Subtitle" w:qFormat="1"/>
     <w:lsdException w:name="Strong" w:qFormat="1"/>
     <w:lsdException w:name="Emphasis" w:qFormat="1"/>
+    <w:lsdException w:name="Normal Table" w:semiHidden="1" w:unhideWhenUsed="1"/>
     <w:lsdException w:name="No List" w:uiPriority="99"/>
+    <w:lsdException w:name="Table Simple 1" w:semiHidden="1" w:unhideWhenUsed="1"/>
+    <w:lsdException w:name="Table Simple 2" w:semiHidden="1" w:unhideWhenUsed="1"/>
+    <w:lsdException w:name="Table Simple 3" w:semiHidden="1" w:unhideWhenUsed="1"/>
+    <w:lsdException w:name="Table Classic 1" w:semiHidden="1" w:unhideWhenUsed="1"/>
+    <w:lsdException w:name="Table Classic 2" w:semiHidden="1" w:unhideWhenUsed="1"/>
+    <w:lsdException w:name="Table Classic 3" w:semiHidden="1" w:unhideWhenUsed="1"/>
+    <w:lsdException w:name="Table Classic 4" w:semiHidden="1" w:unhideWhenUsed="1"/>
+    <w:lsdException w:name="Table Colorful 1" w:semiHidden="1" w:unhideWhenUsed="1"/>
+    <w:lsdException w:name="Table Colorful 2" w:semiHidden="1" w:unhideWhenUsed="1"/>
+    <w:lsdException w:name="Table Colorful 3" w:semiHidden="1" w:unhideWhenUsed="1"/>
+    <w:lsdException w:name="Table Columns 1" w:semiHidden="1" w:unhideWhenUsed="1"/>
+    <w:lsdException w:name="Table Columns 2" w:semiHidden="1" w:unhideWhenUsed="1"/>
+    <w:lsdException w:name="Table Columns 3" w:semiHidden="1" w:unhideWhenUsed="1"/>
+    <w:lsdException w:name="Table Columns 4" w:semiHidden="1" w:unhideWhenUsed="1"/>
+    <w:lsdException w:name="Table Columns 5" w:semiHidden="1" w:unhideWhenUsed="1"/>
+    <w:lsdException w:name="Table Grid 1" w:semiHidden="1" w:unhideWhenUsed="1"/>
+    <w:lsdException w:name="Table Grid 2" w:semiHidden="1" w:unhideWhenUsed="1"/>
+    <w:lsdException w:name="Table Grid 3" w:semiHidden="1" w:unhideWhenUsed="1"/>
+    <w:lsdException w:name="Table Grid 4" w:semiHidden="1" w:unhideWhenUsed="1"/>
+    <w:lsdException w:name="Table Grid 5" w:semiHidden="1" w:unhideWhenUsed="1"/>
+    <w:lsdException w:name="Table Grid 6" w:semiHidden="1" w:unhideWhenUsed="1"/>
+    <w:lsdException w:name="Table Grid 7" w:semiHidden="1" w:unhideWhenUsed="1"/>
+    <w:lsdException w:name="Table Grid 8" w:semiHidden="1" w:unhideWhenUsed="1"/>
+    <w:lsdException w:name="Table List 1" w:semiHidden="1" w:unhideWhenUsed="1"/>
+    <w:lsdException w:name="Table List 2" w:semiHidden="1" w:unhideWhenUsed="1"/>
+    <w:lsdException w:name="Table List 3" w:semiHidden="1" w:unhideWhenUsed="1"/>
+    <w:lsdException w:name="Table List 4" w:semiHidden="1" w:unhideWhenUsed="1"/>
+    <w:lsdException w:name="Table List 5" w:semiHidden="1" w:unhideWhenUsed="1"/>
+    <w:lsdException w:name="Table List 6" w:semiHidden="1" w:unhideWhenUsed="1"/>
+    <w:lsdException w:name="Table List 7" w:semiHidden="1" w:unhideWhenUsed="1"/>
+    <w:lsdException w:name="Table List 8" w:semiHidden="1" w:unhideWhenUsed="1"/>
+    <w:lsdException w:name="Table 3D effects 1" w:semiHidden="1" w:unhideWhenUsed="1"/>
+    <w:lsdException w:name="Table 3D effects 2" w:semiHidden="1" w:unhideWhenUsed="1"/>
+    <w:lsdException w:name="Table 3D effects 3" w:semiHidden="1" w:unhideWhenUsed="1"/>
+    <w:lsdException w:name="Table Contemporary" w:semiHidden="1" w:unhideWhenUsed="1"/>
+    <w:lsdException w:name="Table Elegant" w:semiHidden="1" w:unhideWhenUsed="1"/>
+    <w:lsdException w:name="Table Professional" w:semiHidden="1" w:unhideWhenUsed="1"/>
+    <w:lsdException w:name="Table Subtle 1" w:semiHidden="1" w:unhideWhenUsed="1"/>
+    <w:lsdException w:name="Table Subtle 2" w:semiHidden="1" w:unhideWhenUsed="1"/>
+    <w:lsdException w:name="Table Web 1" w:semiHidden="1" w:unhideWhenUsed="1"/>
+    <w:lsdException w:name="Table Web 2" w:semiHidden="1" w:unhideWhenUsed="1"/>
+    <w:lsdException w:name="Table Web 3" w:semiHidden="1" w:unhideWhenUsed="1"/>
     <w:lsdException w:name="Balloon Text" w:uiPriority="99"/>
+    <w:lsdException w:name="Table Theme" w:semiHidden="1" w:unhideWhenUsed="1"/>
     <w:lsdException w:name="Placeholder Text" w:semiHidden="1" w:uiPriority="99"/>
     <w:lsdException w:name="No Spacing" w:uiPriority="1" w:qFormat="1"/>
     <w:lsdException w:name="Light Shading" w:uiPriority="60"/>
@@ -9110,11 +8703,15 @@
   </w:style>
   <w:style w:type="character" w:default="1" w:styleId="Fuentedeprrafopredeter">
     <w:name w:val="Default Paragraph Font"/>
+    <w:uiPriority w:val="1"/>
     <w:semiHidden/>
+    <w:unhideWhenUsed/>
   </w:style>
   <w:style w:type="table" w:default="1" w:styleId="Tablanormal">
     <w:name w:val="Normal Table"/>
+    <w:uiPriority w:val="99"/>
     <w:semiHidden/>
+    <w:unhideWhenUsed/>
     <w:tblPr>
       <w:tblInd w:w="0" w:type="dxa"/>
       <w:tblCellMar>
@@ -9129,6 +8726,7 @@
     <w:name w:val="No List"/>
     <w:uiPriority w:val="99"/>
     <w:semiHidden/>
+    <w:unhideWhenUsed/>
   </w:style>
   <w:style w:type="paragraph" w:styleId="Textoindependiente3">
     <w:name w:val="Body Text 3"/>
@@ -9146,8 +8744,8 @@
       <w:sz w:val="40"/>
     </w:rPr>
   </w:style>
-  <w:style w:type="paragraph" w:customStyle="1" w:styleId="Heading3">
-    <w:name w:val="Heading 3"/>
+  <w:style w:type="paragraph" w:customStyle="1" w:styleId="Ttulo31">
+    <w:name w:val="Título 31"/>
     <w:basedOn w:val="Normal"/>
     <w:rsid w:val="00BE25B6"/>
     <w:pPr>
@@ -9161,8 +8759,8 @@
       <w:sz w:val="24"/>
     </w:rPr>
   </w:style>
-  <w:style w:type="paragraph" w:customStyle="1" w:styleId="Heading4">
-    <w:name w:val="Heading 4"/>
+  <w:style w:type="paragraph" w:customStyle="1" w:styleId="Ttulo41">
+    <w:name w:val="Título 41"/>
     <w:basedOn w:val="Normal"/>
     <w:rsid w:val="00BE25B6"/>
     <w:pPr>
@@ -9192,8 +8790,8 @@
       <w:u w:val="single"/>
     </w:rPr>
   </w:style>
-  <w:style w:type="paragraph" w:customStyle="1" w:styleId="Heading2">
-    <w:name w:val="Heading 2"/>
+  <w:style w:type="paragraph" w:customStyle="1" w:styleId="Ttulo21">
+    <w:name w:val="Título 21"/>
     <w:basedOn w:val="Normal"/>
     <w:rsid w:val="00BE25B6"/>
     <w:pPr>
@@ -9218,8 +8816,8 @@
       <w:spacing w:after="120" w:line="480" w:lineRule="auto"/>
     </w:pPr>
   </w:style>
-  <w:style w:type="paragraph" w:customStyle="1" w:styleId="Heading1">
-    <w:name w:val="Heading 1"/>
+  <w:style w:type="paragraph" w:customStyle="1" w:styleId="Ttulo11">
+    <w:name w:val="Título 11"/>
     <w:basedOn w:val="Normal"/>
     <w:rsid w:val="00BE25B6"/>
     <w:pPr>
@@ -9233,8 +8831,8 @@
       <w:lang w:val="es-MX"/>
     </w:rPr>
   </w:style>
-  <w:style w:type="paragraph" w:customStyle="1" w:styleId="BodyText2">
-    <w:name w:val="Body Text 2"/>
+  <w:style w:type="paragraph" w:customStyle="1" w:styleId="Textoindependiente21">
+    <w:name w:val="Texto independiente 21"/>
     <w:basedOn w:val="Normal"/>
     <w:rsid w:val="00BE25B6"/>
     <w:pPr>
@@ -9250,8 +8848,8 @@
       <w:sz w:val="24"/>
     </w:rPr>
   </w:style>
-  <w:style w:type="paragraph" w:customStyle="1" w:styleId="BodyText3">
-    <w:name w:val="Body Text 3"/>
+  <w:style w:type="paragraph" w:customStyle="1" w:styleId="Textoindependiente31">
+    <w:name w:val="Texto independiente 31"/>
     <w:basedOn w:val="Normal"/>
     <w:rsid w:val="00BE25B6"/>
     <w:pPr>

</xml_diff>